<commit_message>
Refactor documentation for Remove Old Files (UNC Share) project
- Updated the Design Document to streamline content and remove redundant sections.
- Revised the Implementation Guide to enhance clarity and organization, including prerequisites and step-by-step instructions.
- Improved the User Guide by consolidating information and emphasizing safety measures during execution.
- Enhanced the Validation & Testing Plan with clearer phases and expectations, ensuring comprehensive testing coverage.
- Removed unnecessary project metadata from documentation to focus on actionable content.
</commit_message>
<xml_diff>
--- a/Ansible to Orchestrator Transition/Completed/Move Windows Event Logs/Remove-OldFiles-UNCShare/Documentation/03_Implementation_Guide.docx
+++ b/Ansible to Orchestrator Transition/Completed/Move Windows Event Logs/Remove-OldFiles-UNCShare/Documentation/03_Implementation_Guide.docx
@@ -1,112 +1,14 @@
 
 <file path=word/document.xml><?xml version="1.0" encoding="utf-8"?>
-<w:document xmlns:w="http://schemas.openxmlformats.org/wordprocessingml/2006/main" xmlns:m="http://schemas.openxmlformats.org/officeDocument/2006/math" xmlns:r="http://schemas.openxmlformats.org/officeDocument/2006/relationships" xmlns:o="urn:schemas-microsoft-com:office:office" xmlns:v="urn:schemas-microsoft-com:vml" xmlns:w10="urn:schemas-microsoft-com:office:word" xmlns:a="http://schemas.openxmlformats.org/drawingml/2006/main" xmlns:pic="http://schemas.openxmlformats.org/drawingml/2006/picture" xmlns:wp="http://schemas.openxmlformats.org/drawingml/2006/wordprocessingDrawing">
+<w:document xmlns:wpc="http://schemas.microsoft.com/office/word/2010/wordprocessingCanvas" xmlns:cx="http://schemas.microsoft.com/office/drawing/2014/chartex" xmlns:cx1="http://schemas.microsoft.com/office/drawing/2015/9/8/chartex" xmlns:cx2="http://schemas.microsoft.com/office/drawing/2015/10/21/chartex" xmlns:cx3="http://schemas.microsoft.com/office/drawing/2016/5/9/chartex" xmlns:cx4="http://schemas.microsoft.com/office/drawing/2016/5/10/chartex" xmlns:cx5="http://schemas.microsoft.com/office/drawing/2016/5/11/chartex" xmlns:cx6="http://schemas.microsoft.com/office/drawing/2016/5/12/chartex" xmlns:cx7="http://schemas.microsoft.com/office/drawing/2016/5/13/chartex" xmlns:cx8="http://schemas.microsoft.com/office/drawing/2016/5/14/chartex" xmlns:mc="http://schemas.openxmlformats.org/markup-compatibility/2006" xmlns:aink="http://schemas.microsoft.com/office/drawing/2016/ink" xmlns:am3d="http://schemas.microsoft.com/office/drawing/2017/model3d" xmlns:o="urn:schemas-microsoft-com:office:office" xmlns:oel="http://schemas.microsoft.com/office/2019/extlst" xmlns:r="http://schemas.openxmlformats.org/officeDocument/2006/relationships" xmlns:m="http://schemas.openxmlformats.org/officeDocument/2006/math" xmlns:v="urn:schemas-microsoft-com:vml" xmlns:wp14="http://schemas.microsoft.com/office/word/2010/wordprocessingDrawing" xmlns:wp="http://schemas.openxmlformats.org/drawingml/2006/wordprocessingDrawing" xmlns:w10="urn:schemas-microsoft-com:office:word" xmlns:w="http://schemas.openxmlformats.org/wordprocessingml/2006/main" xmlns:w14="http://schemas.microsoft.com/office/word/2010/wordml" xmlns:w15="http://schemas.microsoft.com/office/word/2012/wordml" xmlns:w16cex="http://schemas.microsoft.com/office/word/2018/wordml/cex" xmlns:w16cid="http://schemas.microsoft.com/office/word/2016/wordml/cid" xmlns:w16="http://schemas.microsoft.com/office/word/2018/wordml" xmlns:w16du="http://schemas.microsoft.com/office/word/2023/wordml/word16du" xmlns:w16sdtdh="http://schemas.microsoft.com/office/word/2020/wordml/sdtdatahash" xmlns:w16sdtfl="http://schemas.microsoft.com/office/word/2024/wordml/sdtformatlock" xmlns:w16se="http://schemas.microsoft.com/office/word/2015/wordml/symex" xmlns:wpg="http://schemas.microsoft.com/office/word/2010/wordprocessingGroup" xmlns:wpi="http://schemas.microsoft.com/office/word/2010/wordprocessingInk" xmlns:wne="http://schemas.microsoft.com/office/word/2006/wordml" xmlns:wps="http://schemas.microsoft.com/office/word/2010/wordprocessingShape" mc:Ignorable="w14 w15 w16se w16cid w16 w16cex w16sdtdh w16sdtfl w16du wp14">
   <w:body>
-    <w:bookmarkStart w:id="18" w:name="X4a6e2283da028e0e993ed712fec43e77067b567"/>
     <w:p>
       <w:pPr>
         <w:pStyle w:val="Heading1"/>
       </w:pPr>
-      <w:r>
-        <w:t xml:space="preserve">Remove Old Files (UNC Share) — Implementation Guide</w:t>
-      </w:r>
-    </w:p>
-    <w:p>
-      <w:pPr>
-        <w:pStyle w:val="FirstParagraph"/>
-      </w:pPr>
-      <w:r>
-        <w:rPr>
-          <w:b/>
-          <w:bCs/>
-        </w:rPr>
-        <w:t xml:space="preserve">Deliverable:</w:t>
-      </w:r>
-      <w:r>
-        <w:t xml:space="preserve"> </w:t>
-      </w:r>
-      <w:r>
-        <w:t xml:space="preserve">Remove-OldFiles-UNCShare</w:t>
-      </w:r>
-      <w:r>
-        <w:t xml:space="preserve"> </w:t>
-      </w:r>
-      <w:r>
-        <w:rPr>
-          <w:b/>
-          <w:bCs/>
-        </w:rPr>
-        <w:t xml:space="preserve">Project:</w:t>
-      </w:r>
-      <w:r>
-        <w:t xml:space="preserve"> </w:t>
-      </w:r>
-      <w:r>
-        <w:t xml:space="preserve">Ansible → VCF Orchestrator transition — "Move Windows Event Logs"</w:t>
-      </w:r>
-      <w:r>
-        <w:t xml:space="preserve"> </w:t>
-      </w:r>
-      <w:r>
-        <w:rPr>
-          <w:b/>
-          <w:bCs/>
-        </w:rPr>
-        <w:t xml:space="preserve">Platform:</w:t>
-      </w:r>
-      <w:r>
-        <w:t xml:space="preserve"> </w:t>
-      </w:r>
-      <w:r>
-        <w:t xml:space="preserve">VCF Automation 9 / VCF Operations Orchestrator 9</w:t>
-      </w:r>
-      <w:r>
-        <w:t xml:space="preserve"> </w:t>
-      </w:r>
-      <w:r>
-        <w:rPr>
-          <w:b/>
-          <w:bCs/>
-        </w:rPr>
-        <w:t xml:space="preserve">Status:</w:t>
-      </w:r>
-      <w:r>
-        <w:t xml:space="preserve"> </w:t>
-      </w:r>
-      <w:r>
-        <w:t xml:space="preserve">Step 1</w:t>
-      </w:r>
-      <w:r>
-        <w:t xml:space="preserve"> </w:t>
-      </w:r>
-      <w:r>
-        <w:rPr>
-          <w:b/>
-          <w:bCs/>
-        </w:rPr>
-        <w:t xml:space="preserve">This set:</w:t>
-      </w:r>
-      <w:r>
-        <w:t xml:space="preserve"> </w:t>
-      </w:r>
-      <w:r>
-        <w:t xml:space="preserve">01 Executive Summary · 02 Design Document · 03 Implementation Guide · 04 User Guide · 05 Validation &amp; Testing Plan · WindowsLogManagement-Config_definition</w:t>
-      </w:r>
-      <w:r>
-        <w:t xml:space="preserve"> </w:t>
-      </w:r>
-      <w:r>
-        <w:rPr>
-          <w:b/>
-          <w:bCs/>
-        </w:rPr>
-        <w:t xml:space="preserve">Shared references:</w:t>
-      </w:r>
-      <w:r>
-        <w:t xml:space="preserve"> </w:t>
-      </w:r>
-      <w:r>
-        <w:t xml:space="preserve">../../_Shared/Documentation/Shared-Components.docx · ../../_Shared/Documentation/Change-Register.docx · ../../_Shared/Documentation/Ansible-to-vRO-MappingTable.docx · "How to Build a PowerShell Host" (Automation Projects/_Shared References/PowerShell Host Build Guide/)</w:t>
+      <w:bookmarkStart w:id="0" w:name="X4a6e2283da028e0e993ed712fec43e77067b567"/>
+      <w:r>
+        <w:t>Remove Old Files (UNC Share) — Implementation Guide</w:t>
       </w:r>
     </w:p>
     <w:p>
@@ -114,23 +16,23 @@
         <w:pStyle w:val="BlockText"/>
       </w:pPr>
       <w:r>
-        <w:t xml:space="preserve">Follow the Steps in order. Later Steps depend on earlier ones.</w:t>
-      </w:r>
-    </w:p>
-    <w:p>
-      <w:r>
-        <w:pict>
-          <v:rect style="width:0;height:1.5pt" o:hralign="center" o:hrstd="t" o:hr="t"/>
+        <w:t>Follow the Steps in order. Later Steps depend on earlier ones.</w:t>
+      </w:r>
+    </w:p>
+    <w:p>
+      <w:r>
+        <w:pict w14:anchorId="1D79A9C9">
+          <v:rect id="_x0000_i1025" style="width:0;height:1.5pt" o:hralign="center" o:hrstd="t" o:hr="t"/>
         </w:pict>
       </w:r>
     </w:p>
-    <w:bookmarkStart w:id="9" w:name="prerequisites"/>
     <w:p>
       <w:pPr>
         <w:pStyle w:val="Heading2"/>
       </w:pPr>
-      <w:r>
-        <w:t xml:space="preserve">Prerequisites</w:t>
+      <w:bookmarkStart w:id="1" w:name="prerequisites"/>
+      <w:r>
+        <w:t>Prerequisites</w:t>
       </w:r>
     </w:p>
     <w:p>
@@ -138,7 +40,7 @@
         <w:pStyle w:val="Compact"/>
         <w:numPr>
           <w:ilvl w:val="0"/>
-          <w:numId w:val="1001"/>
+          <w:numId w:val="2"/>
         </w:numPr>
       </w:pPr>
       <w:r>
@@ -146,50 +48,29 @@
           <w:b/>
           <w:bCs/>
         </w:rPr>
-        <w:t xml:space="preserve">PowerShell (PS) host</w:t>
-      </w:r>
-      <w:r>
-        <w:t xml:space="preserve"> </w:t>
-      </w:r>
-      <w:r>
-        <w:t xml:space="preserve">built and registered in Orchestrator — full procedure</w:t>
-      </w:r>
-      <w:r>
-        <w:t xml:space="preserve"> </w:t>
-      </w:r>
-      <w:r>
-        <w:t xml:space="preserve">(WinRM HTTPS listener 5986, certificate, authentication, Kerberos/</w:t>
+        <w:t>PowerShell (PS) host</w:t>
+      </w:r>
+      <w:r>
+        <w:t xml:space="preserve"> built and registered in Orchestrator — full procedure (WinRM HTTPS listener 5986, certificate, authentication, Kerberos/</w:t>
       </w:r>
       <w:r>
         <w:rPr>
           <w:rStyle w:val="VerbatimChar"/>
         </w:rPr>
-        <w:t xml:space="preserve">krb5.conf</w:t>
-      </w:r>
-      <w:r>
-        <w:t xml:space="preserve">,</w:t>
-      </w:r>
-      <w:r>
-        <w:t xml:space="preserve"> </w:t>
-      </w:r>
-      <w:r>
-        <w:t xml:space="preserve">host registration) is in the shared</w:t>
-      </w:r>
-      <w:r>
-        <w:t xml:space="preserve"> </w:t>
+        <w:t>krb5.conf</w:t>
+      </w:r>
+      <w:r>
+        <w:t xml:space="preserve">, host registration) is in the shared </w:t>
       </w:r>
       <w:r>
         <w:rPr>
           <w:b/>
           <w:bCs/>
         </w:rPr>
-        <w:t xml:space="preserve">"How to Build a PowerShell Host"</w:t>
-      </w:r>
-      <w:r>
-        <w:t xml:space="preserve"> </w:t>
-      </w:r>
-      <w:r>
-        <w:t xml:space="preserve">guide.</w:t>
+        <w:t>"How to Build a PowerShell Host"</w:t>
+      </w:r>
+      <w:r>
+        <w:t xml:space="preserve"> guide.</w:t>
       </w:r>
     </w:p>
     <w:p>
@@ -197,7 +78,7 @@
         <w:pStyle w:val="Compact"/>
         <w:numPr>
           <w:ilvl w:val="0"/>
-          <w:numId w:val="1001"/>
+          <w:numId w:val="2"/>
         </w:numPr>
       </w:pPr>
       <w:r>
@@ -205,14 +86,7 @@
           <w:b/>
           <w:bCs/>
         </w:rPr>
-        <w:t xml:space="preserve">Updated</w:t>
-      </w:r>
-      <w:r>
-        <w:rPr>
-          <w:b/>
-          <w:bCs/>
-        </w:rPr>
-        <w:t xml:space="preserve"> </w:t>
+        <w:t xml:space="preserve">Updated </w:t>
       </w:r>
       <w:r>
         <w:rPr>
@@ -220,13 +94,10 @@
           <w:b/>
           <w:bCs/>
         </w:rPr>
-        <w:t xml:space="preserve">cvs_functions.ps1</w:t>
-      </w:r>
-      <w:r>
-        <w:t xml:space="preserve"> </w:t>
-      </w:r>
-      <w:r>
-        <w:t xml:space="preserve">deployed on the PS host (included in this deliverable)</w:t>
+        <w:t>cvs_functions.ps1</w:t>
+      </w:r>
+      <w:r>
+        <w:t xml:space="preserve"> deployed on the PS host (included in this deliverable)</w:t>
       </w:r>
     </w:p>
     <w:p>
@@ -234,7 +105,7 @@
         <w:pStyle w:val="Compact"/>
         <w:numPr>
           <w:ilvl w:val="0"/>
-          <w:numId w:val="1001"/>
+          <w:numId w:val="2"/>
         </w:numPr>
       </w:pPr>
       <w:r>
@@ -242,35 +113,20 @@
           <w:b/>
           <w:bCs/>
         </w:rPr>
-        <w:t xml:space="preserve">UNC archive share</w:t>
-      </w:r>
-      <w:r>
-        <w:t xml:space="preserve"> </w:t>
-      </w:r>
-      <w:r>
-        <w:t xml:space="preserve">reachable from the PS host with</w:t>
-      </w:r>
-      <w:r>
-        <w:t xml:space="preserve"> </w:t>
+        <w:t>UNC archive share</w:t>
+      </w:r>
+      <w:r>
+        <w:t xml:space="preserve"> reachable from the PS host with </w:t>
       </w:r>
       <w:r>
         <w:rPr>
           <w:b/>
           <w:bCs/>
         </w:rPr>
-        <w:t xml:space="preserve">write/delete</w:t>
-      </w:r>
-      <w:r>
-        <w:t xml:space="preserve"> </w:t>
-      </w:r>
-      <w:r>
-        <w:t xml:space="preserve">access for</w:t>
-      </w:r>
-      <w:r>
-        <w:t xml:space="preserve"> </w:t>
-      </w:r>
-      <w:r>
-        <w:t xml:space="preserve">the service account.</w:t>
+        <w:t>write/delete</w:t>
+      </w:r>
+      <w:r>
+        <w:t xml:space="preserve"> access for the service account.</w:t>
       </w:r>
     </w:p>
     <w:p>
@@ -278,7 +134,7 @@
         <w:pStyle w:val="Compact"/>
         <w:numPr>
           <w:ilvl w:val="0"/>
-          <w:numId w:val="1001"/>
+          <w:numId w:val="2"/>
         </w:numPr>
       </w:pPr>
       <w:r>
@@ -286,13 +142,10 @@
           <w:b/>
           <w:bCs/>
         </w:rPr>
-        <w:t xml:space="preserve">VCF Orchestrator 9</w:t>
-      </w:r>
-      <w:r>
-        <w:t xml:space="preserve"> </w:t>
-      </w:r>
-      <w:r>
-        <w:t xml:space="preserve">with the PowerShell plug-in and administrative access.</w:t>
+        <w:t>VCF Orchestrator 9</w:t>
+      </w:r>
+      <w:r>
+        <w:t xml:space="preserve"> with the PowerShell plug-in and administrative access.</w:t>
       </w:r>
     </w:p>
     <w:p>
@@ -300,41 +153,38 @@
         <w:pStyle w:val="Compact"/>
         <w:numPr>
           <w:ilvl w:val="0"/>
-          <w:numId w:val="1001"/>
+          <w:numId w:val="2"/>
         </w:numPr>
       </w:pPr>
       <w:r>
-        <w:t xml:space="preserve">Network: Orchestrator → PS host</w:t>
-      </w:r>
-      <w:r>
-        <w:t xml:space="preserve"> </w:t>
+        <w:t xml:space="preserve">Network: Orchestrator → PS host </w:t>
       </w:r>
       <w:r>
         <w:rPr>
           <w:b/>
           <w:bCs/>
         </w:rPr>
-        <w:t xml:space="preserve">TCP 5986</w:t>
-      </w:r>
-      <w:r>
-        <w:t xml:space="preserve">; PS host → the UNC share (SMB 445).</w:t>
-      </w:r>
-    </w:p>
-    <w:p>
-      <w:r>
-        <w:pict>
-          <v:rect style="width:0;height:1.5pt" o:hralign="center" o:hrstd="t" o:hr="t"/>
+        <w:t>TCP 5986</w:t>
+      </w:r>
+      <w:r>
+        <w:t>; PS host → the UNC share (SMB 445).</w:t>
+      </w:r>
+    </w:p>
+    <w:p>
+      <w:r>
+        <w:pict w14:anchorId="5F735624">
+          <v:rect id="_x0000_i1026" style="width:0;height:1.5pt" o:hralign="center" o:hrstd="t" o:hr="t"/>
         </w:pict>
       </w:r>
     </w:p>
-    <w:bookmarkEnd w:id="9"/>
-    <w:bookmarkStart w:id="10" w:name="step-1--build-and-register-the-ps-host"/>
     <w:p>
       <w:pPr>
         <w:pStyle w:val="Heading2"/>
       </w:pPr>
-      <w:r>
-        <w:t xml:space="preserve">Step 1 — Build and register the PS host</w:t>
+      <w:bookmarkStart w:id="2" w:name="step-1--build-and-register-the-ps-host"/>
+      <w:bookmarkEnd w:id="1"/>
+      <w:r>
+        <w:t>Step 1 — Build and register the PS host</w:t>
       </w:r>
     </w:p>
     <w:p>
@@ -342,36 +192,27 @@
         <w:pStyle w:val="FirstParagraph"/>
       </w:pPr>
       <w:r>
-        <w:t xml:space="preserve">Build the PS host (RSAT AD tools, WinRM HTTPS listener on 5986, certificate, service account into</w:t>
-      </w:r>
-      <w:r>
-        <w:t xml:space="preserve"> </w:t>
+        <w:t xml:space="preserve">Build the PS host (RSAT AD tools, WinRM HTTPS listener on 5986, certificate, service account into </w:t>
       </w:r>
       <w:r>
         <w:rPr>
           <w:i/>
           <w:iCs/>
         </w:rPr>
-        <w:t xml:space="preserve">Remote Management Users</w:t>
-      </w:r>
-      <w:r>
-        <w:t xml:space="preserve">, script directory) per the shared</w:t>
-      </w:r>
-      <w:r>
-        <w:t xml:space="preserve"> </w:t>
+        <w:t>Remote Management Users</w:t>
+      </w:r>
+      <w:r>
+        <w:t xml:space="preserve">, script directory) per the shared </w:t>
       </w:r>
       <w:r>
         <w:rPr>
           <w:b/>
           <w:bCs/>
         </w:rPr>
-        <w:t xml:space="preserve">"How to Build a PowerShell Host"</w:t>
-      </w:r>
-      <w:r>
-        <w:t xml:space="preserve"> </w:t>
-      </w:r>
-      <w:r>
-        <w:t xml:space="preserve">guide. Confirm the 5986 listener actually came up before proceeding.</w:t>
+        <w:t>"How to Build a PowerShell Host"</w:t>
+      </w:r>
+      <w:r>
+        <w:t xml:space="preserve"> guide. Confirm the 5986 listener actually came up before proceeding.</w:t>
       </w:r>
     </w:p>
     <w:p>
@@ -379,17 +220,17 @@
         <w:pStyle w:val="BlockText"/>
       </w:pPr>
       <w:r>
-        <w:t xml:space="preserve">Defer all host-build detail to the PS-Host guide. Do not repeat it here.</w:t>
-      </w:r>
-    </w:p>
-    <w:bookmarkEnd w:id="10"/>
-    <w:bookmarkStart w:id="11" w:name="step-2--deploy-the-powershell-script"/>
+        <w:t>Defer all host-build detail to the PS-Host guide. Do not repeat it here.</w:t>
+      </w:r>
+    </w:p>
     <w:p>
       <w:pPr>
         <w:pStyle w:val="Heading2"/>
       </w:pPr>
-      <w:r>
-        <w:t xml:space="preserve">Step 2 — Deploy the PowerShell script</w:t>
+      <w:bookmarkStart w:id="3" w:name="step-2--deploy-the-powershell-script"/>
+      <w:bookmarkEnd w:id="2"/>
+      <w:r>
+        <w:t>Step 2 — Deploy the PowerShell script</w:t>
       </w:r>
     </w:p>
     <w:p>
@@ -397,21 +238,18 @@
         <w:pStyle w:val="Compact"/>
         <w:numPr>
           <w:ilvl w:val="0"/>
-          <w:numId w:val="1002"/>
+          <w:numId w:val="3"/>
         </w:numPr>
       </w:pPr>
       <w:r>
-        <w:t xml:space="preserve">Copy the</w:t>
-      </w:r>
-      <w:r>
-        <w:t xml:space="preserve"> </w:t>
+        <w:t xml:space="preserve">Copy the </w:t>
       </w:r>
       <w:r>
         <w:rPr>
           <w:b/>
           <w:bCs/>
         </w:rPr>
-        <w:t xml:space="preserve">updated</w:t>
+        <w:t>updated</w:t>
       </w:r>
       <w:r>
         <w:t xml:space="preserve"> </w:t>
@@ -420,25 +258,19 @@
         <w:rPr>
           <w:rStyle w:val="VerbatimChar"/>
         </w:rPr>
-        <w:t xml:space="preserve">cvs_functions.ps1</w:t>
-      </w:r>
-      <w:r>
-        <w:t xml:space="preserve"> </w:t>
-      </w:r>
-      <w:r>
-        <w:t xml:space="preserve">(changes S-1…S-5 — Change-Register, shared) to the script directory, e.g.</w:t>
-      </w:r>
-      <w:r>
-        <w:t xml:space="preserve"> </w:t>
+        <w:t>cvs_functions.ps1</w:t>
+      </w:r>
+      <w:r>
+        <w:t xml:space="preserve"> (changes S-1…S-5 — Change-Register, shared) to the script directory, e.g. </w:t>
       </w:r>
       <w:r>
         <w:rPr>
           <w:rStyle w:val="VerbatimChar"/>
         </w:rPr>
-        <w:t xml:space="preserve">C:\PSO\Scripts\cvs_functions.ps1</w:t>
-      </w:r>
-      <w:r>
-        <w:t xml:space="preserve">.</w:t>
+        <w:t>C:\PSO\Scripts\cvs_functions.ps1</w:t>
+      </w:r>
+      <w:r>
+        <w:t>.</w:t>
       </w:r>
     </w:p>
     <w:p>
@@ -446,11 +278,11 @@
         <w:pStyle w:val="Compact"/>
         <w:numPr>
           <w:ilvl w:val="0"/>
-          <w:numId w:val="1002"/>
+          <w:numId w:val="3"/>
         </w:numPr>
       </w:pPr>
       <w:r>
-        <w:t xml:space="preserve">Confirm the Move-relevant behavior is present:</w:t>
+        <w:t>Confirm the Move-relevant behavior is present:</w:t>
       </w:r>
     </w:p>
     <w:p>
@@ -461,7 +293,7 @@
         <w:rPr>
           <w:rStyle w:val="FunctionTok"/>
         </w:rPr>
-        <w:t xml:space="preserve">Test-Path</w:t>
+        <w:t>Test-Path</w:t>
       </w:r>
       <w:r>
         <w:rPr>
@@ -473,7 +305,7 @@
         <w:rPr>
           <w:rStyle w:val="StringTok"/>
         </w:rPr>
-        <w:t xml:space="preserve">'C:\PSO\Scripts\cvs_functions.ps1'</w:t>
+        <w:t>'C:\PSO\Scripts\cvs_functions.ps1'</w:t>
       </w:r>
       <w:r>
         <w:br/>
@@ -482,7 +314,7 @@
         <w:rPr>
           <w:rStyle w:val="FunctionTok"/>
         </w:rPr>
-        <w:t xml:space="preserve">Select-String</w:t>
+        <w:t>Select-String</w:t>
       </w:r>
       <w:r>
         <w:rPr>
@@ -494,7 +326,7 @@
         <w:rPr>
           <w:rStyle w:val="OperatorTok"/>
         </w:rPr>
-        <w:t xml:space="preserve">-</w:t>
+        <w:t>-</w:t>
       </w:r>
       <w:r>
         <w:rPr>
@@ -506,7 +338,7 @@
         <w:rPr>
           <w:rStyle w:val="StringTok"/>
         </w:rPr>
-        <w:t xml:space="preserve">'C:\PSO\Scripts\cvs_functions.ps1'</w:t>
+        <w:t>'C:\PSO\Scripts\cvs_functions.ps1'</w:t>
       </w:r>
       <w:r>
         <w:rPr>
@@ -518,13 +350,13 @@
         <w:rPr>
           <w:rStyle w:val="OperatorTok"/>
         </w:rPr>
-        <w:t xml:space="preserve">-</w:t>
+        <w:t>-</w:t>
       </w:r>
       <w:r>
         <w:rPr>
           <w:rStyle w:val="NormalTok"/>
         </w:rPr>
-        <w:t xml:space="preserve">Pattern `</w:t>
+        <w:t>Pattern `</w:t>
       </w:r>
       <w:r>
         <w:br/>
@@ -539,31 +371,31 @@
         <w:rPr>
           <w:rStyle w:val="StringTok"/>
         </w:rPr>
-        <w:t xml:space="preserve">"move-archived-logs-ByCN"</w:t>
+        <w:t>"move-archived-logs-ByCN"</w:t>
       </w:r>
       <w:r>
         <w:rPr>
           <w:rStyle w:val="OperatorTok"/>
         </w:rPr>
-        <w:t xml:space="preserve">,</w:t>
+        <w:t>,</w:t>
       </w:r>
       <w:r>
         <w:rPr>
           <w:rStyle w:val="StringTok"/>
         </w:rPr>
-        <w:t xml:space="preserve">"ErrorAction Stop"</w:t>
+        <w:t>"ErrorAction Stop"</w:t>
       </w:r>
       <w:r>
         <w:rPr>
           <w:rStyle w:val="OperatorTok"/>
         </w:rPr>
-        <w:t xml:space="preserve">,</w:t>
+        <w:t>,</w:t>
       </w:r>
       <w:r>
         <w:rPr>
           <w:rStyle w:val="StringTok"/>
         </w:rPr>
-        <w:t xml:space="preserve">"skipping disabled computer"</w:t>
+        <w:t>"skipping disabled computer"</w:t>
       </w:r>
     </w:p>
     <w:p>
@@ -571,17 +403,17 @@
         <w:pStyle w:val="FirstParagraph"/>
       </w:pPr>
       <w:r>
-        <w:t xml:space="preserve">All patterns must be found (confirms the action and the S-2…S-4 resilient behavior).</w:t>
-      </w:r>
-    </w:p>
-    <w:bookmarkEnd w:id="11"/>
-    <w:bookmarkStart w:id="12" w:name="X844d59bfb4c4b591dea9200a6fdad11c01ac3d7"/>
+        <w:t>All patterns must be found (confirms the action and the S-2…S-4 resilient behavior).</w:t>
+      </w:r>
+    </w:p>
     <w:p>
       <w:pPr>
         <w:pStyle w:val="Heading2"/>
       </w:pPr>
-      <w:r>
-        <w:t xml:space="preserve">Step 3 — Certificate trust in Orchestrator</w:t>
+      <w:bookmarkStart w:id="4" w:name="X844d59bfb4c4b591dea9200a6fdad11c01ac3d7"/>
+      <w:bookmarkEnd w:id="3"/>
+      <w:r>
+        <w:t>Step 3 — Certificate trust in Orchestrator</w:t>
       </w:r>
     </w:p>
     <w:p>
@@ -589,20 +421,17 @@
         <w:pStyle w:val="FirstParagraph"/>
       </w:pPr>
       <w:r>
-        <w:t xml:space="preserve">If the PS host cert is self-signed or from a CA not already trusted by Orchestrator, import it (Base-64/PEM) via</w:t>
-      </w:r>
-      <w:r>
-        <w:t xml:space="preserve"> </w:t>
+        <w:t xml:space="preserve">If the PS host cert is self-signed or from a CA not already trusted by Orchestrator, import it (Base-64/PEM) via </w:t>
       </w:r>
       <w:r>
         <w:rPr>
           <w:b/>
           <w:bCs/>
         </w:rPr>
-        <w:t xml:space="preserve">Library &gt; Configuration &gt; SSL Trust Manager</w:t>
-      </w:r>
-      <w:r>
-        <w:t xml:space="preserve">. Full procedure in the PS-Host guide.</w:t>
+        <w:t>Library &gt; Configuration &gt; SSL Trust Manager</w:t>
+      </w:r>
+      <w:r>
+        <w:t>. Full procedure in the PS-Host guide.</w:t>
       </w:r>
     </w:p>
     <w:p>
@@ -610,17 +439,18 @@
         <w:pStyle w:val="BlockText"/>
       </w:pPr>
       <w:r>
-        <w:t xml:space="preserve">1–3 line summary only — defer to the PS-Host guide.</w:t>
-      </w:r>
-    </w:p>
-    <w:bookmarkEnd w:id="12"/>
-    <w:bookmarkStart w:id="13" w:name="step-4--authentication"/>
+        <w:t>1–3 line summary only — defer to the PS-Host guide.</w:t>
+      </w:r>
+    </w:p>
     <w:p>
       <w:pPr>
         <w:pStyle w:val="Heading2"/>
       </w:pPr>
-      <w:r>
-        <w:t xml:space="preserve">Step 4 — Authentication</w:t>
+      <w:bookmarkStart w:id="5" w:name="step-4--authentication"/>
+      <w:bookmarkEnd w:id="4"/>
+      <w:r>
+        <w:lastRenderedPageBreak/>
+        <w:t>Step 4 — Authentication</w:t>
       </w:r>
     </w:p>
     <w:p>
@@ -628,51 +458,36 @@
         <w:pStyle w:val="FirstParagraph"/>
       </w:pPr>
       <w:r>
-        <w:t xml:space="preserve">Choose Basic-over-HTTPS (lab) or Kerberos (production).</w:t>
-      </w:r>
-      <w:r>
-        <w:t xml:space="preserve"> </w:t>
+        <w:t xml:space="preserve">Choose Basic-over-HTTPS (lab) or Kerberos (production). </w:t>
       </w:r>
       <w:r>
         <w:rPr>
           <w:b/>
           <w:bCs/>
         </w:rPr>
-        <w:t xml:space="preserve">This choice determines whether the second hop (PS host → remote UNC) works — validate it in Step 7.</w:t>
-      </w:r>
-      <w:r>
-        <w:t xml:space="preserve"> </w:t>
-      </w:r>
-      <w:r>
-        <w:t xml:space="preserve">Kerberos additionally requires</w:t>
-      </w:r>
-      <w:r>
-        <w:t xml:space="preserve"> </w:t>
+        <w:t>This choice determines whether the second hop (PS host → remote UNC) works — validate it in Step 7.</w:t>
+      </w:r>
+      <w:r>
+        <w:t xml:space="preserve"> Kerberos additionally requires </w:t>
       </w:r>
       <w:r>
         <w:rPr>
           <w:b/>
           <w:bCs/>
         </w:rPr>
-        <w:t xml:space="preserve">constrained delegation</w:t>
-      </w:r>
-      <w:r>
-        <w:t xml:space="preserve"> </w:t>
-      </w:r>
-      <w:r>
-        <w:t xml:space="preserve">on the PS host's AD computer account for the second hop. Full Kerberos setup (</w:t>
+        <w:t>constrained delegation</w:t>
+      </w:r>
+      <w:r>
+        <w:t xml:space="preserve"> on the PS host's AD computer account for the second hop. Full Kerberos setup (</w:t>
       </w:r>
       <w:r>
         <w:rPr>
           <w:rStyle w:val="VerbatimChar"/>
         </w:rPr>
-        <w:t xml:space="preserve">krb5.conf</w:t>
-      </w:r>
-      <w:r>
-        <w:t xml:space="preserve"> </w:t>
-      </w:r>
-      <w:r>
-        <w:t xml:space="preserve">format, realm case, salt/name-length, the bring-up error sequence) is in the PS-Host guide.</w:t>
+        <w:t>krb5.conf</w:t>
+      </w:r>
+      <w:r>
+        <w:t xml:space="preserve"> format, realm case, salt/name-length, the bring-up error sequence) is in the PS-Host guide.</w:t>
       </w:r>
     </w:p>
     <w:p>
@@ -680,17 +495,17 @@
         <w:pStyle w:val="BlockText"/>
       </w:pPr>
       <w:r>
-        <w:t xml:space="preserve">Defer Kerberos / krb5.conf detail to the PS-Host guide.</w:t>
-      </w:r>
-    </w:p>
-    <w:bookmarkEnd w:id="13"/>
-    <w:bookmarkStart w:id="14" w:name="X1d6481d6cf5520244b6a50c7f64b692c53b2a59"/>
+        <w:t>Defer Kerberos / krb5.conf detail to the PS-Host guide.</w:t>
+      </w:r>
+    </w:p>
     <w:p>
       <w:pPr>
         <w:pStyle w:val="Heading2"/>
       </w:pPr>
-      <w:r>
-        <w:t xml:space="preserve">Step 5 — Register the PS host in Orchestrator</w:t>
+      <w:bookmarkStart w:id="6" w:name="X1d6481d6cf5520244b6a50c7f64b692c53b2a59"/>
+      <w:bookmarkEnd w:id="5"/>
+      <w:r>
+        <w:t>Step 5 — Register the PS host in Orchestrator</w:t>
       </w:r>
     </w:p>
     <w:p>
@@ -698,60 +513,51 @@
         <w:pStyle w:val="FirstParagraph"/>
       </w:pPr>
       <w:r>
-        <w:t xml:space="preserve">Register via</w:t>
-      </w:r>
-      <w:r>
-        <w:t xml:space="preserve"> </w:t>
+        <w:t xml:space="preserve">Register via </w:t>
       </w:r>
       <w:r>
         <w:rPr>
           <w:b/>
           <w:bCs/>
         </w:rPr>
-        <w:t xml:space="preserve">Library &gt; PowerShell &gt; Configuration &gt; Add a PowerShell host</w:t>
-      </w:r>
-      <w:r>
-        <w:t xml:space="preserve"> </w:t>
-      </w:r>
-      <w:r>
-        <w:t xml:space="preserve">(Host = FQDN, Port 5986, Transport HTTPS, Auth Basic or Kerberos, Shared Session, Username in UPN form). Expect</w:t>
-      </w:r>
-      <w:r>
-        <w:t xml:space="preserve"> </w:t>
+        <w:t>Library &gt; PowerShell &gt; Configuration &gt; Add a PowerShell host</w:t>
+      </w:r>
+      <w:r>
+        <w:t xml:space="preserve"> (Host = FQDN, Port 5986, Transport HTTPS, Auth Basic or Kerberos, Shared Session, Username in UPN form). Expect </w:t>
       </w:r>
       <w:r>
         <w:rPr>
           <w:b/>
           <w:bCs/>
         </w:rPr>
-        <w:t xml:space="preserve">Completed</w:t>
-      </w:r>
-      <w:r>
-        <w:t xml:space="preserve">. Auth errors map to the PS-Host guide.</w:t>
-      </w:r>
-    </w:p>
-    <w:p>
-      <w:r>
-        <w:pict>
-          <v:rect style="width:0;height:1.5pt" o:hralign="center" o:hrstd="t" o:hr="t"/>
+        <w:t>Completed</w:t>
+      </w:r>
+      <w:r>
+        <w:t>. Auth errors map to the PS-Host guide.</w:t>
+      </w:r>
+    </w:p>
+    <w:p>
+      <w:r>
+        <w:pict w14:anchorId="66BC7FEA">
+          <v:rect id="_x0000_i1027" style="width:0;height:1.5pt" o:hralign="center" o:hrstd="t" o:hr="t"/>
         </w:pict>
       </w:r>
     </w:p>
-    <w:bookmarkEnd w:id="14"/>
-    <w:bookmarkStart w:id="15" w:name="X5824d20788b5b415cf93d2f3cd7a40be6000968"/>
     <w:p>
       <w:pPr>
         <w:pStyle w:val="Heading2"/>
       </w:pPr>
-      <w:r>
-        <w:t xml:space="preserve">Step 6 — Import action and build the workflow</w:t>
+      <w:bookmarkStart w:id="7" w:name="X5824d20788b5b415cf93d2f3cd7a40be6000968"/>
+      <w:bookmarkEnd w:id="6"/>
+      <w:r>
+        <w:t>Step 6 — Import action and build the workflow</w:t>
       </w:r>
     </w:p>
     <w:p>
       <w:pPr>
         <w:numPr>
           <w:ilvl w:val="0"/>
-          <w:numId w:val="1003"/>
+          <w:numId w:val="4"/>
         </w:numPr>
       </w:pPr>
       <w:r>
@@ -759,13 +565,10 @@
           <w:b/>
           <w:bCs/>
         </w:rPr>
-        <w:t xml:space="preserve">Orchestrator Package</w:t>
-      </w:r>
-      <w:r>
-        <w:t xml:space="preserve"> </w:t>
-      </w:r>
-      <w:r>
-        <w:t xml:space="preserve">:</w:t>
+        <w:t>Orchestrator Package</w:t>
+      </w:r>
+      <w:r>
+        <w:t xml:space="preserve"> :</w:t>
       </w:r>
     </w:p>
     <w:p>
@@ -773,18 +576,18 @@
         <w:pStyle w:val="Compact"/>
         <w:numPr>
           <w:ilvl w:val="1"/>
-          <w:numId w:val="1004"/>
+          <w:numId w:val="5"/>
         </w:numPr>
       </w:pPr>
       <w:r>
-        <w:t xml:space="preserve">import the Orchestrator package com.broadcom.pso.cvs-dt.conus.eventlogarchivesmove into Orchestrator</w:t>
+        <w:t>import the Orchestrator package com.broadcom.pso.cvs-dt.conus.eventlogarchivesmove into Orchestrator</w:t>
       </w:r>
     </w:p>
     <w:p>
       <w:pPr>
         <w:numPr>
           <w:ilvl w:val="0"/>
-          <w:numId w:val="1003"/>
+          <w:numId w:val="4"/>
         </w:numPr>
       </w:pPr>
       <w:r>
@@ -792,7 +595,7 @@
           <w:b/>
           <w:bCs/>
         </w:rPr>
-        <w:t xml:space="preserve">Workflow</w:t>
+        <w:t>Workflow</w:t>
       </w:r>
       <w:r>
         <w:t xml:space="preserve"> </w:t>
@@ -801,25 +604,19 @@
         <w:rPr>
           <w:rStyle w:val="VerbatimChar"/>
         </w:rPr>
-        <w:t xml:space="preserve">Remove-OldFiles-UNCShare</w:t>
-      </w:r>
-      <w:r>
-        <w:t xml:space="preserve"> </w:t>
-      </w:r>
-      <w:r>
-        <w:t xml:space="preserve">(folder</w:t>
-      </w:r>
-      <w:r>
-        <w:t xml:space="preserve"> </w:t>
+        <w:t>Remove-OldFiles-UNCShare</w:t>
+      </w:r>
+      <w:r>
+        <w:t xml:space="preserve"> (folder </w:t>
       </w:r>
       <w:r>
         <w:rPr>
           <w:rStyle w:val="VerbatimChar"/>
         </w:rPr>
-        <w:t xml:space="preserve">Production &gt; Servers &gt; Windows &gt; Event Log Management</w:t>
-      </w:r>
-      <w:r>
-        <w:t xml:space="preserve">);</w:t>
+        <w:t>Production &gt; Servers &gt; Windows &gt; Event Log Management</w:t>
+      </w:r>
+      <w:r>
+        <w:t>);</w:t>
       </w:r>
     </w:p>
     <w:p>
@@ -827,28 +624,28 @@
         <w:pStyle w:val="Compact"/>
         <w:numPr>
           <w:ilvl w:val="1"/>
-          <w:numId w:val="1005"/>
+          <w:numId w:val="6"/>
         </w:numPr>
       </w:pPr>
       <w:r>
-        <w:t xml:space="preserve">update the psHost variable to be the value of the PowerShell host object created as a result of Step 5</w:t>
-      </w:r>
-    </w:p>
-    <w:p>
-      <w:r>
-        <w:pict>
-          <v:rect style="width:0;height:1.5pt" o:hralign="center" o:hrstd="t" o:hr="t"/>
+        <w:t>update the psHost variable to be the value of the PowerShell host object created as a result of Step 5</w:t>
+      </w:r>
+    </w:p>
+    <w:p>
+      <w:r>
+        <w:pict w14:anchorId="68840FDE">
+          <v:rect id="_x0000_i1028" style="width:0;height:1.5pt" o:hralign="center" o:hrstd="t" o:hr="t"/>
         </w:pict>
       </w:r>
     </w:p>
-    <w:bookmarkEnd w:id="15"/>
-    <w:bookmarkStart w:id="16" w:name="step-7--validation-gate"/>
     <w:p>
       <w:pPr>
         <w:pStyle w:val="Heading2"/>
       </w:pPr>
-      <w:r>
-        <w:t xml:space="preserve">Step 7 — Validation gate</w:t>
+      <w:bookmarkStart w:id="8" w:name="step-7--validation-gate"/>
+      <w:bookmarkEnd w:id="7"/>
+      <w:r>
+        <w:t>Step 7 — Validation gate</w:t>
       </w:r>
     </w:p>
     <w:p>
@@ -856,19 +653,16 @@
         <w:pStyle w:val="FirstParagraph"/>
       </w:pPr>
       <w:r>
-        <w:t xml:space="preserve">Run the plan in</w:t>
-      </w:r>
-      <w:r>
-        <w:t xml:space="preserve"> </w:t>
+        <w:t xml:space="preserve">Run the plan in </w:t>
       </w:r>
       <w:r>
         <w:rPr>
           <w:rStyle w:val="VerbatimChar"/>
         </w:rPr>
-        <w:t xml:space="preserve">05_Validation_and_Testing_Plan.docx</w:t>
-      </w:r>
-      <w:r>
-        <w:t xml:space="preserve">. Minimum gate:</w:t>
+        <w:t>05_Validation_and_Testing_Plan.docx</w:t>
+      </w:r>
+      <w:r>
+        <w:t>. Minimum gate:</w:t>
       </w:r>
     </w:p>
     <w:p>
@@ -876,7 +670,7 @@
         <w:pStyle w:val="Compact"/>
         <w:numPr>
           <w:ilvl w:val="0"/>
-          <w:numId w:val="1006"/>
+          <w:numId w:val="7"/>
         </w:numPr>
       </w:pPr>
       <w:r>
@@ -885,27 +679,17 @@
           <w:b/>
           <w:bCs/>
         </w:rPr>
-        <w:t xml:space="preserve">-ReportOnly</w:t>
+        <w:t>-ReportOnly</w:t>
       </w:r>
       <w:r>
         <w:rPr>
           <w:b/>
           <w:bCs/>
         </w:rPr>
-        <w:t xml:space="preserve"> </w:t>
-      </w:r>
-      <w:r>
-        <w:rPr>
-          <w:b/>
-          <w:bCs/>
-        </w:rPr>
-        <w:t xml:space="preserve">deployed</w:t>
-      </w:r>
-      <w:r>
-        <w:t xml:space="preserve"> </w:t>
-      </w:r>
-      <w:r>
-        <w:t xml:space="preserve">(A11) confirmed on the PS host.</w:t>
+        <w:t xml:space="preserve"> deployed</w:t>
+      </w:r>
+      <w:r>
+        <w:t xml:space="preserve"> (A11) confirmed on the PS host.</w:t>
       </w:r>
     </w:p>
     <w:p>
@@ -913,7 +697,7 @@
         <w:pStyle w:val="Compact"/>
         <w:numPr>
           <w:ilvl w:val="0"/>
-          <w:numId w:val="1006"/>
+          <w:numId w:val="7"/>
         </w:numPr>
       </w:pPr>
       <w:r>
@@ -921,13 +705,10 @@
           <w:b/>
           <w:bCs/>
         </w:rPr>
-        <w:t xml:space="preserve">UNC write/delete</w:t>
-      </w:r>
-      <w:r>
-        <w:t xml:space="preserve"> </w:t>
-      </w:r>
-      <w:r>
-        <w:t xml:space="preserve">access from the PS host under the service account (A8).</w:t>
+        <w:t>UNC write/delete</w:t>
+      </w:r>
+      <w:r>
+        <w:t xml:space="preserve"> access from the PS host under the service account (A8).</w:t>
       </w:r>
     </w:p>
     <w:p>
@@ -935,7 +716,7 @@
         <w:pStyle w:val="Compact"/>
         <w:numPr>
           <w:ilvl w:val="0"/>
-          <w:numId w:val="1006"/>
+          <w:numId w:val="7"/>
         </w:numPr>
       </w:pPr>
       <w:r>
@@ -943,43 +724,28 @@
           <w:b/>
           <w:bCs/>
         </w:rPr>
-        <w:t xml:space="preserve">Report-only run</w:t>
-      </w:r>
-      <w:r>
-        <w:t xml:space="preserve"> </w:t>
-      </w:r>
-      <w:r>
-        <w:t xml:space="preserve">(D3):</w:t>
-      </w:r>
-      <w:r>
-        <w:t xml:space="preserve"> </w:t>
+        <w:t>Report-only run</w:t>
+      </w:r>
+      <w:r>
+        <w:t xml:space="preserve"> (D3): </w:t>
       </w:r>
       <w:r>
         <w:rPr>
           <w:rStyle w:val="VerbatimChar"/>
         </w:rPr>
-        <w:t xml:space="preserve">whatIf='yes'</w:t>
-      </w:r>
-      <w:r>
-        <w:t xml:space="preserve"> </w:t>
-      </w:r>
-      <w:r>
-        <w:t xml:space="preserve">completes non-interactively, lists</w:t>
-      </w:r>
-      <w:r>
-        <w:t xml:space="preserve"> </w:t>
+        <w:t>whatIf='yes'</w:t>
+      </w:r>
+      <w:r>
+        <w:t xml:space="preserve"> completes non-interactively, lists </w:t>
       </w:r>
       <w:r>
         <w:rPr>
           <w:rStyle w:val="VerbatimChar"/>
         </w:rPr>
-        <w:t xml:space="preserve">[ReportOnly] WouldDelete:</w:t>
-      </w:r>
-      <w:r>
-        <w:t xml:space="preserve"> </w:t>
-      </w:r>
-      <w:r>
-        <w:t xml:space="preserve">lines, deletes nothing, Deletion Summary = 0.</w:t>
+        <w:t>[ReportOnly] WouldDelete:</w:t>
+      </w:r>
+      <w:r>
+        <w:t xml:space="preserve"> lines, deletes nothing, Deletion Summary = 0.</w:t>
       </w:r>
     </w:p>
     <w:p>
@@ -987,7 +753,7 @@
         <w:pStyle w:val="Compact"/>
         <w:numPr>
           <w:ilvl w:val="0"/>
-          <w:numId w:val="1006"/>
+          <w:numId w:val="7"/>
         </w:numPr>
       </w:pPr>
       <w:r>
@@ -995,51 +761,37 @@
           <w:b/>
           <w:bCs/>
         </w:rPr>
-        <w:t xml:space="preserve">Live delete</w:t>
-      </w:r>
-      <w:r>
-        <w:t xml:space="preserve"> </w:t>
-      </w:r>
-      <w:r>
-        <w:t xml:space="preserve">(D2): only after a reviewed preview,</w:t>
-      </w:r>
-      <w:r>
-        <w:t xml:space="preserve"> </w:t>
+        <w:t>Live delete</w:t>
+      </w:r>
+      <w:r>
+        <w:t xml:space="preserve"> (D2): only after a reviewed preview, </w:t>
       </w:r>
       <w:r>
         <w:rPr>
           <w:rStyle w:val="VerbatimChar"/>
         </w:rPr>
-        <w:t xml:space="preserve">whatIf='no'</w:t>
-      </w:r>
-      <w:r>
-        <w:t xml:space="preserve"> </w:t>
-      </w:r>
-      <w:r>
-        <w:t xml:space="preserve">against a</w:t>
-      </w:r>
-      <w:r>
-        <w:t xml:space="preserve"> </w:t>
-      </w:r>
-      <w:r>
-        <w:t xml:space="preserve">non-production share deletes exactly the aged test files.</w:t>
-      </w:r>
-    </w:p>
-    <w:p>
-      <w:r>
-        <w:pict>
-          <v:rect style="width:0;height:1.5pt" o:hralign="center" o:hrstd="t" o:hr="t"/>
+        <w:t>whatIf='no'</w:t>
+      </w:r>
+      <w:r>
+        <w:t xml:space="preserve"> against a non-production share deletes exactly the aged test files.</w:t>
+      </w:r>
+    </w:p>
+    <w:p>
+      <w:r>
+        <w:pict w14:anchorId="2D61AC03">
+          <v:rect id="_x0000_i1029" style="width:0;height:1.5pt" o:hralign="center" o:hrstd="t" o:hr="t"/>
         </w:pict>
       </w:r>
     </w:p>
-    <w:bookmarkEnd w:id="16"/>
-    <w:bookmarkStart w:id="17" w:name="rollback-considerations"/>
     <w:p>
       <w:pPr>
         <w:pStyle w:val="Heading2"/>
       </w:pPr>
-      <w:r>
-        <w:t xml:space="preserve">Rollback considerations</w:t>
+      <w:bookmarkStart w:id="9" w:name="rollback-considerations"/>
+      <w:bookmarkEnd w:id="8"/>
+      <w:r>
+        <w:lastRenderedPageBreak/>
+        <w:t>Rollback considerations</w:t>
       </w:r>
     </w:p>
     <w:p>
@@ -1047,7 +799,7 @@
         <w:pStyle w:val="Compact"/>
         <w:numPr>
           <w:ilvl w:val="0"/>
-          <w:numId w:val="1007"/>
+          <w:numId w:val="8"/>
         </w:numPr>
       </w:pPr>
       <w:r>
@@ -1055,35 +807,20 @@
           <w:b/>
           <w:bCs/>
         </w:rPr>
-        <w:t xml:space="preserve">Workflow / action / Config Element:</w:t>
-      </w:r>
-      <w:r>
-        <w:t xml:space="preserve"> </w:t>
-      </w:r>
-      <w:r>
-        <w:t xml:space="preserve">all items are new — disable or delete the</w:t>
-      </w:r>
-      <w:r>
-        <w:t xml:space="preserve"> </w:t>
-      </w:r>
-      <w:r>
-        <w:t xml:space="preserve">imported Orchestrator objects; no existing vRO content is modified. The OOTB</w:t>
-      </w:r>
-      <w:r>
-        <w:t xml:space="preserve"> </w:t>
+        <w:t>Workflow / action / Config Element:</w:t>
+      </w:r>
+      <w:r>
+        <w:t xml:space="preserve"> all items are new — disable or delete the imported Orchestrator objects; no existing vRO content is modified. The OOTB </w:t>
       </w:r>
       <w:r>
         <w:rPr>
           <w:i/>
           <w:iCs/>
         </w:rPr>
-        <w:t xml:space="preserve">Invoke a PowerShell script</w:t>
-      </w:r>
-      <w:r>
-        <w:t xml:space="preserve"> </w:t>
-      </w:r>
-      <w:r>
-        <w:t xml:space="preserve">workflow is not modified.</w:t>
+        <w:t>Invoke a PowerShell script</w:t>
+      </w:r>
+      <w:r>
+        <w:t xml:space="preserve"> workflow is not modified.</w:t>
       </w:r>
     </w:p>
     <w:p>
@@ -1091,7 +828,7 @@
         <w:pStyle w:val="Compact"/>
         <w:numPr>
           <w:ilvl w:val="0"/>
-          <w:numId w:val="1007"/>
+          <w:numId w:val="8"/>
         </w:numPr>
       </w:pPr>
       <w:r>
@@ -1099,46 +836,28 @@
           <w:b/>
           <w:bCs/>
         </w:rPr>
-        <w:t xml:space="preserve">PS host script:</w:t>
-      </w:r>
-      <w:r>
-        <w:t xml:space="preserve"> </w:t>
-      </w:r>
-      <w:r>
-        <w:t xml:space="preserve">retain the previous</w:t>
-      </w:r>
-      <w:r>
-        <w:t xml:space="preserve"> </w:t>
+        <w:t>PS host script:</w:t>
+      </w:r>
+      <w:r>
+        <w:t xml:space="preserve"> retain the previous </w:t>
       </w:r>
       <w:r>
         <w:rPr>
           <w:rStyle w:val="VerbatimChar"/>
         </w:rPr>
-        <w:t xml:space="preserve">cvs_functions.ps1</w:t>
-      </w:r>
-      <w:r>
-        <w:t xml:space="preserve">; redeploy to revert</w:t>
-      </w:r>
-      <w:r>
-        <w:t xml:space="preserve"> </w:t>
-      </w:r>
-      <w:r>
-        <w:t xml:space="preserve">(note: reverting S-1 restores the blocking</w:t>
-      </w:r>
-      <w:r>
-        <w:t xml:space="preserve"> </w:t>
+        <w:t>cvs_functions.ps1</w:t>
+      </w:r>
+      <w:r>
+        <w:t xml:space="preserve">; redeploy to revert (note: reverting S-1 restores the blocking </w:t>
       </w:r>
       <w:r>
         <w:rPr>
           <w:rStyle w:val="VerbatimChar"/>
         </w:rPr>
-        <w:t xml:space="preserve">Read-Host</w:t>
-      </w:r>
-      <w:r>
-        <w:t xml:space="preserve"> </w:t>
-      </w:r>
-      <w:r>
-        <w:t xml:space="preserve">prompt under vRO).</w:t>
+        <w:t>Read-Host</w:t>
+      </w:r>
+      <w:r>
+        <w:t xml:space="preserve"> prompt under vRO).</w:t>
       </w:r>
     </w:p>
     <w:p>
@@ -1146,7 +865,7 @@
         <w:pStyle w:val="Compact"/>
         <w:numPr>
           <w:ilvl w:val="0"/>
-          <w:numId w:val="1007"/>
+          <w:numId w:val="8"/>
         </w:numPr>
       </w:pPr>
       <w:r>
@@ -1154,109 +873,60 @@
           <w:b/>
           <w:bCs/>
         </w:rPr>
-        <w:t xml:space="preserve">Data — deletions are permanent.</w:t>
-      </w:r>
-      <w:r>
-        <w:t xml:space="preserve"> </w:t>
-      </w:r>
-      <w:r>
-        <w:t xml:space="preserve">There is</w:t>
-      </w:r>
-      <w:r>
-        <w:t xml:space="preserve"> </w:t>
+        <w:t>Data — deletions are permanent.</w:t>
+      </w:r>
+      <w:r>
+        <w:t xml:space="preserve"> There is </w:t>
       </w:r>
       <w:r>
         <w:rPr>
           <w:b/>
           <w:bCs/>
         </w:rPr>
-        <w:t xml:space="preserve">no automated recovery</w:t>
-      </w:r>
-      <w:r>
-        <w:t xml:space="preserve"> </w:t>
-      </w:r>
-      <w:r>
-        <w:t xml:space="preserve">for files</w:t>
-      </w:r>
-      <w:r>
-        <w:t xml:space="preserve"> </w:t>
-      </w:r>
-      <w:r>
-        <w:t xml:space="preserve">deleted with</w:t>
-      </w:r>
-      <w:r>
-        <w:t xml:space="preserve"> </w:t>
+        <w:t>no automated recovery</w:t>
+      </w:r>
+      <w:r>
+        <w:t xml:space="preserve"> for files deleted with </w:t>
       </w:r>
       <w:r>
         <w:rPr>
           <w:rStyle w:val="VerbatimChar"/>
         </w:rPr>
-        <w:t xml:space="preserve">whatIf='no'</w:t>
-      </w:r>
-      <w:r>
-        <w:t xml:space="preserve">. Mitigation: always run report-only and review the</w:t>
-      </w:r>
-      <w:r>
-        <w:t xml:space="preserve"> </w:t>
+        <w:t>whatIf='no'</w:t>
+      </w:r>
+      <w:r>
+        <w:t xml:space="preserve">. Mitigation: always run report-only and review the </w:t>
       </w:r>
       <w:r>
         <w:rPr>
           <w:rStyle w:val="VerbatimChar"/>
         </w:rPr>
-        <w:t xml:space="preserve">WouldDelete</w:t>
-      </w:r>
-      <w:r>
-        <w:t xml:space="preserve"> </w:t>
-      </w:r>
-      <w:r>
-        <w:t xml:space="preserve">list before any live delete. Ansible remains available as a fallback</w:t>
-      </w:r>
-      <w:r>
-        <w:t xml:space="preserve"> </w:t>
-      </w:r>
-      <w:r>
-        <w:t xml:space="preserve">until cutover is confirmed.</w:t>
-      </w:r>
-    </w:p>
-    <w:bookmarkEnd w:id="17"/>
-    <w:bookmarkEnd w:id="18"/>
+        <w:t>WouldDelete</w:t>
+      </w:r>
+      <w:r>
+        <w:t xml:space="preserve"> list before any live delete. Ansible remains available as a fallback until cutover is confirmed.</w:t>
+      </w:r>
+      <w:bookmarkEnd w:id="0"/>
+      <w:bookmarkEnd w:id="9"/>
+    </w:p>
     <w:sectPr>
       <w:footnotePr>
         <w:numRestart w:val="eachSect"/>
       </w:footnotePr>
+      <w:pgSz w:w="12240" w:h="15840"/>
+      <w:pgMar w:top="1440" w:right="1440" w:bottom="1440" w:left="1440" w:header="720" w:footer="720" w:gutter="0"/>
+      <w:cols w:space="720"/>
     </w:sectPr>
   </w:body>
 </w:document>
 </file>
 
-<file path=word/comments.xml><?xml version="1.0" encoding="utf-8"?>
-<w:comments xmlns:w="http://schemas.openxmlformats.org/wordprocessingml/2006/main" xmlns:m="http://schemas.openxmlformats.org/officeDocument/2006/math" xmlns:r="http://schemas.openxmlformats.org/officeDocument/2006/relationships" xmlns:o="urn:schemas-microsoft-com:office:office" xmlns:v="urn:schemas-microsoft-com:vml" xmlns:w10="urn:schemas-microsoft-com:office:word" xmlns:a="http://schemas.openxmlformats.org/drawingml/2006/main" xmlns:pic="http://schemas.openxmlformats.org/drawingml/2006/picture" xmlns:wp="http://schemas.openxmlformats.org/drawingml/2006/wordprocessingDrawing"/>
-</file>
-
-<file path=word/footnotes.xml><?xml version="1.0" encoding="utf-8"?>
-<w:footnotes xmlns:w="http://schemas.openxmlformats.org/wordprocessingml/2006/main" xmlns:m="http://schemas.openxmlformats.org/officeDocument/2006/math" xmlns:r="http://schemas.openxmlformats.org/officeDocument/2006/relationships" xmlns:o="urn:schemas-microsoft-com:office:office" xmlns:v="urn:schemas-microsoft-com:vml" xmlns:w10="urn:schemas-microsoft-com:office:word" xmlns:a="http://schemas.openxmlformats.org/drawingml/2006/main" xmlns:pic="http://schemas.openxmlformats.org/drawingml/2006/picture" xmlns:wp="http://schemas.openxmlformats.org/drawingml/2006/wordprocessingDrawing">
-  <w:footnote w:type="continuationSeparator" w:id="0">
-    <w:p>
-      <w:r>
-        <w:continuationSeparator/>
-      </w:r>
-    </w:p>
-  </w:footnote>
-  <w:footnote w:type="separator" w:id="-1">
-    <w:p>
-      <w:r>
-        <w:separator/>
-      </w:r>
-    </w:p>
-  </w:footnote>
-</w:footnotes>
-</file>
-
 <file path=word/numbering.xml><?xml version="1.0" encoding="utf-8"?>
-<w:numbering xmlns:w="http://schemas.openxmlformats.org/wordprocessingml/2006/main">
-  <w:abstractNum w:abstractNumId="990">
+<w:numbering xmlns:wpc="http://schemas.microsoft.com/office/word/2010/wordprocessingCanvas" xmlns:cx="http://schemas.microsoft.com/office/drawing/2014/chartex" xmlns:cx1="http://schemas.microsoft.com/office/drawing/2015/9/8/chartex" xmlns:cx2="http://schemas.microsoft.com/office/drawing/2015/10/21/chartex" xmlns:cx3="http://schemas.microsoft.com/office/drawing/2016/5/9/chartex" xmlns:cx4="http://schemas.microsoft.com/office/drawing/2016/5/10/chartex" xmlns:cx5="http://schemas.microsoft.com/office/drawing/2016/5/11/chartex" xmlns:cx6="http://schemas.microsoft.com/office/drawing/2016/5/12/chartex" xmlns:cx7="http://schemas.microsoft.com/office/drawing/2016/5/13/chartex" xmlns:cx8="http://schemas.microsoft.com/office/drawing/2016/5/14/chartex" xmlns:mc="http://schemas.openxmlformats.org/markup-compatibility/2006" xmlns:aink="http://schemas.microsoft.com/office/drawing/2016/ink" xmlns:am3d="http://schemas.microsoft.com/office/drawing/2017/model3d" xmlns:o="urn:schemas-microsoft-com:office:office" xmlns:oel="http://schemas.microsoft.com/office/2019/extlst" xmlns:r="http://schemas.openxmlformats.org/officeDocument/2006/relationships" xmlns:m="http://schemas.openxmlformats.org/officeDocument/2006/math" xmlns:v="urn:schemas-microsoft-com:vml" xmlns:wp14="http://schemas.microsoft.com/office/word/2010/wordprocessingDrawing" xmlns:wp="http://schemas.openxmlformats.org/drawingml/2006/wordprocessingDrawing" xmlns:w10="urn:schemas-microsoft-com:office:word" xmlns:w="http://schemas.openxmlformats.org/wordprocessingml/2006/main" xmlns:w14="http://schemas.microsoft.com/office/word/2010/wordml" xmlns:w15="http://schemas.microsoft.com/office/word/2012/wordml" xmlns:w16cex="http://schemas.microsoft.com/office/word/2018/wordml/cex" xmlns:w16cid="http://schemas.microsoft.com/office/word/2016/wordml/cid" xmlns:w16="http://schemas.microsoft.com/office/word/2018/wordml" xmlns:w16du="http://schemas.microsoft.com/office/word/2023/wordml/word16du" xmlns:w16sdtdh="http://schemas.microsoft.com/office/word/2020/wordml/sdtdatahash" xmlns:w16sdtfl="http://schemas.microsoft.com/office/word/2024/wordml/sdtformatlock" xmlns:w16se="http://schemas.microsoft.com/office/word/2015/wordml/symex" xmlns:wpg="http://schemas.microsoft.com/office/word/2010/wordprocessingGroup" xmlns:wpi="http://schemas.microsoft.com/office/word/2010/wordprocessingInk" xmlns:wne="http://schemas.microsoft.com/office/word/2006/wordml" xmlns:wps="http://schemas.microsoft.com/office/word/2010/wordprocessingShape" mc:Ignorable="w14 w15 w16se w16cid w16 w16cex w16sdtdh w16sdtfl w16du wp14">
+  <w:abstractNum w:abstractNumId="0" w15:restartNumberingAfterBreak="0">
     <w:nsid w:val="0000A990"/>
     <w:multiLevelType w:val="multilevel"/>
+    <w:tmpl w:val="AD3C78B2"/>
     <w:lvl w:ilvl="0">
       <w:numFmt w:val="bullet"/>
       <w:lvlText w:val=" "/>
@@ -1330,9 +1000,10 @@
       </w:pPr>
     </w:lvl>
   </w:abstractNum>
-  <w:abstractNum w:abstractNumId="991">
+  <w:abstractNum w:abstractNumId="1" w15:restartNumberingAfterBreak="0">
     <w:nsid w:val="0000A991"/>
     <w:multiLevelType w:val="multilevel"/>
+    <w:tmpl w:val="343C46CA"/>
     <w:lvl w:ilvl="0">
       <w:numFmt w:val="bullet"/>
       <w:lvlText w:val=""/>
@@ -1433,9 +1104,10 @@
       </w:rPr>
     </w:lvl>
   </w:abstractNum>
-  <w:abstractNum w:abstractNumId="99411">
+  <w:abstractNum w:abstractNumId="2" w15:restartNumberingAfterBreak="0">
     <w:nsid w:val="00A99411"/>
     <w:multiLevelType w:val="multilevel"/>
+    <w:tmpl w:val="12D0257C"/>
     <w:lvl w:ilvl="0">
       <w:start w:val="1"/>
       <w:numFmt w:val="decimal"/>
@@ -1518,17 +1190,17 @@
       </w:pPr>
     </w:lvl>
   </w:abstractNum>
-  <w:num w:numId="1000">
-    <w:abstractNumId w:val="990"/>
+  <w:num w:numId="1" w16cid:durableId="137456177">
+    <w:abstractNumId w:val="0"/>
   </w:num>
-  <w:num w:numId="1001">
-    <w:abstractNumId w:val="991"/>
+  <w:num w:numId="2" w16cid:durableId="1221593185">
+    <w:abstractNumId w:val="1"/>
   </w:num>
-  <w:num w:numId="1002">
-    <w:abstractNumId w:val="991"/>
+  <w:num w:numId="3" w16cid:durableId="1794135295">
+    <w:abstractNumId w:val="1"/>
   </w:num>
-  <w:num w:numId="1003">
-    <w:abstractNumId w:val="99411"/>
+  <w:num w:numId="4" w16cid:durableId="1824084136">
+    <w:abstractNumId w:val="2"/>
     <w:lvlOverride w:ilvl="0">
       <w:startOverride w:val="1"/>
     </w:lvlOverride>
@@ -1557,30 +1229,30 @@
       <w:startOverride w:val="1"/>
     </w:lvlOverride>
   </w:num>
-  <w:num w:numId="1004">
-    <w:abstractNumId w:val="991"/>
+  <w:num w:numId="5" w16cid:durableId="274681181">
+    <w:abstractNumId w:val="1"/>
   </w:num>
-  <w:num w:numId="1005">
-    <w:abstractNumId w:val="991"/>
+  <w:num w:numId="6" w16cid:durableId="350377196">
+    <w:abstractNumId w:val="1"/>
   </w:num>
-  <w:num w:numId="1006">
-    <w:abstractNumId w:val="991"/>
+  <w:num w:numId="7" w16cid:durableId="373968727">
+    <w:abstractNumId w:val="1"/>
   </w:num>
-  <w:num w:numId="1007">
-    <w:abstractNumId w:val="991"/>
+  <w:num w:numId="8" w16cid:durableId="1595896850">
+    <w:abstractNumId w:val="1"/>
   </w:num>
 </w:numbering>
 </file>
 
 <file path=word/styles.xml><?xml version="1.0" encoding="utf-8"?>
-<w:styles xmlns:r="http://schemas.openxmlformats.org/officeDocument/2006/relationships" xmlns:w="http://schemas.openxmlformats.org/wordprocessingml/2006/main">
+<w:styles xmlns:mc="http://schemas.openxmlformats.org/markup-compatibility/2006" xmlns:r="http://schemas.openxmlformats.org/officeDocument/2006/relationships" xmlns:w="http://schemas.openxmlformats.org/wordprocessingml/2006/main" xmlns:w14="http://schemas.microsoft.com/office/word/2010/wordml" xmlns:w15="http://schemas.microsoft.com/office/word/2012/wordml" xmlns:w16cex="http://schemas.microsoft.com/office/word/2018/wordml/cex" xmlns:w16cid="http://schemas.microsoft.com/office/word/2016/wordml/cid" xmlns:w16="http://schemas.microsoft.com/office/word/2018/wordml" xmlns:w16du="http://schemas.microsoft.com/office/word/2023/wordml/word16du" xmlns:w16sdtdh="http://schemas.microsoft.com/office/word/2020/wordml/sdtdatahash" xmlns:w16sdtfl="http://schemas.microsoft.com/office/word/2024/wordml/sdtformatlock" xmlns:w16se="http://schemas.microsoft.com/office/word/2015/wordml/symex" mc:Ignorable="w14 w15 w16se w16cid w16 w16cex w16sdtdh w16sdtfl w16du">
   <w:docDefaults>
     <w:rPrDefault>
       <w:rPr>
-        <w:rFonts w:asciiTheme="minorHAnsi" w:cstheme="minorBidi" w:eastAsiaTheme="minorEastAsia" w:hAnsiTheme="minorHAnsi"/>
+        <w:rFonts w:asciiTheme="minorHAnsi" w:eastAsiaTheme="minorEastAsia" w:hAnsiTheme="minorHAnsi" w:cstheme="minorBidi"/>
         <w:sz w:val="24"/>
         <w:szCs w:val="24"/>
-        <w:lang w:bidi="ar-SA" w:eastAsia="zh-CN" w:val="en-US"/>
+        <w:lang w:val="en-US" w:eastAsia="zh-CN" w:bidi="ar-SA"/>
       </w:rPr>
     </w:rPrDefault>
     <w:pPrDefault>
@@ -1589,168 +1261,255 @@
       </w:pPr>
     </w:pPrDefault>
   </w:docDefaults>
-  <w:latentStyles w:count="276" w:defLockedState="0" w:defQFormat="0" w:defSemiHidden="0" w:defUIPriority="0" w:defUnhideWhenUsed="0"/>
-  <w:style w:default="1" w:styleId="Normal" w:type="paragraph">
+  <w:latentStyles w:defLockedState="0" w:defUIPriority="0" w:defSemiHidden="0" w:defUnhideWhenUsed="0" w:defQFormat="0" w:count="376">
+    <w:lsdException w:name="Normal Table" w:semiHidden="1" w:unhideWhenUsed="1"/>
+    <w:lsdException w:name="Table Simple 1" w:semiHidden="1" w:unhideWhenUsed="1"/>
+    <w:lsdException w:name="Table Simple 2" w:semiHidden="1" w:unhideWhenUsed="1"/>
+    <w:lsdException w:name="Table Simple 3" w:semiHidden="1" w:unhideWhenUsed="1"/>
+    <w:lsdException w:name="Table Classic 1" w:semiHidden="1" w:unhideWhenUsed="1"/>
+    <w:lsdException w:name="Table Classic 2" w:semiHidden="1" w:unhideWhenUsed="1"/>
+    <w:lsdException w:name="Table Classic 3" w:semiHidden="1" w:unhideWhenUsed="1"/>
+    <w:lsdException w:name="Table Classic 4" w:semiHidden="1" w:unhideWhenUsed="1"/>
+    <w:lsdException w:name="Table Colorful 1" w:semiHidden="1" w:unhideWhenUsed="1"/>
+    <w:lsdException w:name="Table Colorful 2" w:semiHidden="1" w:unhideWhenUsed="1"/>
+    <w:lsdException w:name="Table Colorful 3" w:semiHidden="1" w:unhideWhenUsed="1"/>
+    <w:lsdException w:name="Table Columns 1" w:semiHidden="1" w:unhideWhenUsed="1"/>
+    <w:lsdException w:name="Table Columns 2" w:semiHidden="1" w:unhideWhenUsed="1"/>
+    <w:lsdException w:name="Table Columns 3" w:semiHidden="1" w:unhideWhenUsed="1"/>
+    <w:lsdException w:name="Table Columns 4" w:semiHidden="1" w:unhideWhenUsed="1"/>
+    <w:lsdException w:name="Table Columns 5" w:semiHidden="1" w:unhideWhenUsed="1"/>
+    <w:lsdException w:name="Table Grid 1" w:semiHidden="1" w:unhideWhenUsed="1"/>
+    <w:lsdException w:name="Table Grid 2" w:semiHidden="1" w:unhideWhenUsed="1"/>
+    <w:lsdException w:name="Table Grid 3" w:semiHidden="1" w:unhideWhenUsed="1"/>
+    <w:lsdException w:name="Table Grid 4" w:semiHidden="1" w:unhideWhenUsed="1"/>
+    <w:lsdException w:name="Table Grid 5" w:semiHidden="1" w:unhideWhenUsed="1"/>
+    <w:lsdException w:name="Table Grid 6" w:semiHidden="1" w:unhideWhenUsed="1"/>
+    <w:lsdException w:name="Table Grid 7" w:semiHidden="1" w:unhideWhenUsed="1"/>
+    <w:lsdException w:name="Table Grid 8" w:semiHidden="1" w:unhideWhenUsed="1"/>
+    <w:lsdException w:name="Table List 1" w:semiHidden="1" w:unhideWhenUsed="1"/>
+    <w:lsdException w:name="Table List 2" w:semiHidden="1" w:unhideWhenUsed="1"/>
+    <w:lsdException w:name="Table List 3" w:semiHidden="1" w:unhideWhenUsed="1"/>
+    <w:lsdException w:name="Table List 4" w:semiHidden="1" w:unhideWhenUsed="1"/>
+    <w:lsdException w:name="Table List 5" w:semiHidden="1" w:unhideWhenUsed="1"/>
+    <w:lsdException w:name="Table List 6" w:semiHidden="1" w:unhideWhenUsed="1"/>
+    <w:lsdException w:name="Table List 7" w:semiHidden="1" w:unhideWhenUsed="1"/>
+    <w:lsdException w:name="Table List 8" w:semiHidden="1" w:unhideWhenUsed="1"/>
+    <w:lsdException w:name="Table 3D effects 1" w:semiHidden="1" w:unhideWhenUsed="1"/>
+    <w:lsdException w:name="Table 3D effects 2" w:semiHidden="1" w:unhideWhenUsed="1"/>
+    <w:lsdException w:name="Table 3D effects 3" w:semiHidden="1" w:unhideWhenUsed="1"/>
+    <w:lsdException w:name="Table Contemporary" w:semiHidden="1" w:unhideWhenUsed="1"/>
+    <w:lsdException w:name="Table Elegant" w:semiHidden="1" w:unhideWhenUsed="1"/>
+    <w:lsdException w:name="Table Professional" w:semiHidden="1" w:unhideWhenUsed="1"/>
+    <w:lsdException w:name="Table Subtle 1" w:semiHidden="1" w:unhideWhenUsed="1"/>
+    <w:lsdException w:name="Table Subtle 2" w:semiHidden="1" w:unhideWhenUsed="1"/>
+    <w:lsdException w:name="Table Web 1" w:semiHidden="1" w:unhideWhenUsed="1"/>
+    <w:lsdException w:name="Table Web 2" w:semiHidden="1" w:unhideWhenUsed="1"/>
+    <w:lsdException w:name="Table Web 3" w:semiHidden="1" w:unhideWhenUsed="1"/>
+    <w:lsdException w:name="Table Theme" w:semiHidden="1" w:unhideWhenUsed="1"/>
+    <w:lsdException w:name="Light Shading"/>
+    <w:lsdException w:name="Light List"/>
+    <w:lsdException w:name="Light Grid"/>
+    <w:lsdException w:name="Medium Shading 1"/>
+    <w:lsdException w:name="Medium Shading 2"/>
+    <w:lsdException w:name="Medium List 1"/>
+    <w:lsdException w:name="Medium List 2"/>
+    <w:lsdException w:name="Medium Grid 1"/>
+    <w:lsdException w:name="Medium Grid 2"/>
+    <w:lsdException w:name="Medium Grid 3"/>
+    <w:lsdException w:name="Dark List"/>
+    <w:lsdException w:name="Colorful Shading"/>
+    <w:lsdException w:name="Colorful List"/>
+    <w:lsdException w:name="Colorful Grid"/>
+    <w:lsdException w:name="Light Shading Accent 1"/>
+    <w:lsdException w:name="Light List Accent 1"/>
+    <w:lsdException w:name="Light Grid Accent 1"/>
+    <w:lsdException w:name="Medium Shading 1 Accent 1"/>
+    <w:lsdException w:name="Medium Shading 2 Accent 1"/>
+    <w:lsdException w:name="Medium List 1 Accent 1"/>
+    <w:lsdException w:name="Medium List 2 Accent 1"/>
+    <w:lsdException w:name="Medium Grid 1 Accent 1"/>
+    <w:lsdException w:name="Medium Grid 2 Accent 1"/>
+    <w:lsdException w:name="Medium Grid 3 Accent 1"/>
+    <w:lsdException w:name="Dark List Accent 1"/>
+    <w:lsdException w:name="Colorful Shading Accent 1"/>
+    <w:lsdException w:name="Colorful List Accent 1"/>
+    <w:lsdException w:name="Colorful Grid Accent 1"/>
+    <w:lsdException w:name="Light Shading Accent 2"/>
+    <w:lsdException w:name="Light List Accent 2"/>
+    <w:lsdException w:name="Light Grid Accent 2"/>
+    <w:lsdException w:name="Medium Shading 1 Accent 2"/>
+    <w:lsdException w:name="Medium Shading 2 Accent 2"/>
+    <w:lsdException w:name="Medium List 1 Accent 2"/>
+    <w:lsdException w:name="Medium List 2 Accent 2"/>
+    <w:lsdException w:name="Medium Grid 1 Accent 2"/>
+    <w:lsdException w:name="Medium Grid 2 Accent 2"/>
+    <w:lsdException w:name="Medium Grid 3 Accent 2"/>
+    <w:lsdException w:name="Dark List Accent 2"/>
+    <w:lsdException w:name="Colorful Shading Accent 2"/>
+    <w:lsdException w:name="Colorful List Accent 2"/>
+    <w:lsdException w:name="Colorful Grid Accent 2"/>
+    <w:lsdException w:name="Light Shading Accent 3"/>
+    <w:lsdException w:name="Light List Accent 3"/>
+    <w:lsdException w:name="Light Grid Accent 3"/>
+    <w:lsdException w:name="Medium Shading 1 Accent 3"/>
+    <w:lsdException w:name="Medium Shading 2 Accent 3"/>
+    <w:lsdException w:name="Medium List 1 Accent 3"/>
+    <w:lsdException w:name="Medium List 2 Accent 3"/>
+    <w:lsdException w:name="Medium Grid 1 Accent 3"/>
+    <w:lsdException w:name="Medium Grid 2 Accent 3"/>
+    <w:lsdException w:name="Medium Grid 3 Accent 3"/>
+    <w:lsdException w:name="Dark List Accent 3"/>
+    <w:lsdException w:name="Colorful Shading Accent 3"/>
+    <w:lsdException w:name="Colorful List Accent 3"/>
+    <w:lsdException w:name="Colorful Grid Accent 3"/>
+    <w:lsdException w:name="Light Shading Accent 4"/>
+    <w:lsdException w:name="Light List Accent 4"/>
+    <w:lsdException w:name="Light Grid Accent 4"/>
+    <w:lsdException w:name="Medium Shading 1 Accent 4"/>
+    <w:lsdException w:name="Medium Shading 2 Accent 4"/>
+    <w:lsdException w:name="Medium List 1 Accent 4"/>
+    <w:lsdException w:name="Medium List 2 Accent 4"/>
+    <w:lsdException w:name="Medium Grid 1 Accent 4"/>
+    <w:lsdException w:name="Medium Grid 2 Accent 4"/>
+    <w:lsdException w:name="Medium Grid 3 Accent 4"/>
+    <w:lsdException w:name="Dark List Accent 4"/>
+    <w:lsdException w:name="Colorful Shading Accent 4"/>
+    <w:lsdException w:name="Colorful List Accent 4"/>
+    <w:lsdException w:name="Colorful Grid Accent 4"/>
+    <w:lsdException w:name="Light Shading Accent 5"/>
+    <w:lsdException w:name="Light List Accent 5"/>
+    <w:lsdException w:name="Light Grid Accent 5"/>
+    <w:lsdException w:name="Medium Shading 1 Accent 5"/>
+    <w:lsdException w:name="Medium Shading 2 Accent 5"/>
+    <w:lsdException w:name="Medium List 1 Accent 5"/>
+    <w:lsdException w:name="Medium List 2 Accent 5"/>
+    <w:lsdException w:name="Medium Grid 1 Accent 5"/>
+    <w:lsdException w:name="Medium Grid 2 Accent 5"/>
+    <w:lsdException w:name="Medium Grid 3 Accent 5"/>
+    <w:lsdException w:name="Dark List Accent 5"/>
+    <w:lsdException w:name="Colorful Shading Accent 5"/>
+    <w:lsdException w:name="Colorful List Accent 5"/>
+    <w:lsdException w:name="Colorful Grid Accent 5"/>
+    <w:lsdException w:name="Light Shading Accent 6"/>
+    <w:lsdException w:name="Light List Accent 6"/>
+    <w:lsdException w:name="Light Grid Accent 6"/>
+    <w:lsdException w:name="Medium Shading 1 Accent 6"/>
+    <w:lsdException w:name="Medium Shading 2 Accent 6"/>
+    <w:lsdException w:name="Medium List 1 Accent 6"/>
+    <w:lsdException w:name="Medium List 2 Accent 6"/>
+    <w:lsdException w:name="Medium Grid 1 Accent 6"/>
+    <w:lsdException w:name="Medium Grid 2 Accent 6"/>
+    <w:lsdException w:name="Medium Grid 3 Accent 6"/>
+    <w:lsdException w:name="Dark List Accent 6"/>
+    <w:lsdException w:name="Colorful Shading Accent 6"/>
+    <w:lsdException w:name="Colorful List Accent 6"/>
+    <w:lsdException w:name="Colorful Grid Accent 6"/>
+    <w:lsdException w:name="Grid Table 4" w:uiPriority="49"/>
+    <w:lsdException w:name="Grid Table 5 Dark" w:uiPriority="50"/>
+    <w:lsdException w:name="Grid Table 6 Colorful" w:uiPriority="51"/>
+    <w:lsdException w:name="Grid Table 7 Colorful" w:uiPriority="52"/>
+    <w:lsdException w:name="Grid Table 1 Light Accent 1" w:uiPriority="46"/>
+    <w:lsdException w:name="Grid Table 2 Accent 1" w:uiPriority="47"/>
+    <w:lsdException w:name="Grid Table 3 Accent 1" w:uiPriority="48"/>
+    <w:lsdException w:name="Grid Table 4 Accent 1" w:uiPriority="49"/>
+    <w:lsdException w:name="Grid Table 5 Dark Accent 1" w:uiPriority="50"/>
+    <w:lsdException w:name="Grid Table 6 Colorful Accent 1" w:uiPriority="51"/>
+    <w:lsdException w:name="Grid Table 7 Colorful Accent 1" w:uiPriority="52"/>
+    <w:lsdException w:name="Grid Table 1 Light Accent 2" w:uiPriority="46"/>
+    <w:lsdException w:name="Grid Table 2 Accent 2" w:uiPriority="47"/>
+    <w:lsdException w:name="Grid Table 3 Accent 2" w:uiPriority="48"/>
+    <w:lsdException w:name="Grid Table 4 Accent 2" w:uiPriority="49"/>
+    <w:lsdException w:name="Grid Table 5 Dark Accent 2" w:uiPriority="50"/>
+    <w:lsdException w:name="Grid Table 6 Colorful Accent 2" w:uiPriority="51"/>
+    <w:lsdException w:name="Grid Table 7 Colorful Accent 2" w:uiPriority="52"/>
+    <w:lsdException w:name="Grid Table 1 Light Accent 3" w:uiPriority="46"/>
+    <w:lsdException w:name="Grid Table 2 Accent 3" w:uiPriority="47"/>
+    <w:lsdException w:name="Grid Table 3 Accent 3" w:uiPriority="48"/>
+    <w:lsdException w:name="Grid Table 4 Accent 3" w:uiPriority="49"/>
+    <w:lsdException w:name="Grid Table 5 Dark Accent 3" w:uiPriority="50"/>
+    <w:lsdException w:name="Grid Table 6 Colorful Accent 3" w:uiPriority="51"/>
+    <w:lsdException w:name="Grid Table 7 Colorful Accent 3" w:uiPriority="52"/>
+    <w:lsdException w:name="Grid Table 1 Light Accent 4" w:uiPriority="46"/>
+    <w:lsdException w:name="Grid Table 2 Accent 4" w:uiPriority="47"/>
+    <w:lsdException w:name="Grid Table 3 Accent 4" w:uiPriority="48"/>
+    <w:lsdException w:name="Grid Table 4 Accent 4" w:uiPriority="49"/>
+    <w:lsdException w:name="Grid Table 5 Dark Accent 4" w:uiPriority="50"/>
+    <w:lsdException w:name="Grid Table 6 Colorful Accent 4" w:uiPriority="51"/>
+    <w:lsdException w:name="Grid Table 7 Colorful Accent 4" w:uiPriority="52"/>
+    <w:lsdException w:name="Grid Table 1 Light Accent 5" w:uiPriority="46"/>
+    <w:lsdException w:name="Grid Table 2 Accent 5" w:uiPriority="47"/>
+    <w:lsdException w:name="Grid Table 3 Accent 5" w:uiPriority="48"/>
+    <w:lsdException w:name="Grid Table 4 Accent 5" w:uiPriority="49"/>
+    <w:lsdException w:name="Grid Table 5 Dark Accent 5" w:uiPriority="50"/>
+    <w:lsdException w:name="Grid Table 6 Colorful Accent 5" w:uiPriority="51"/>
+    <w:lsdException w:name="Grid Table 7 Colorful Accent 5" w:uiPriority="52"/>
+    <w:lsdException w:name="Grid Table 1 Light Accent 6" w:uiPriority="46"/>
+    <w:lsdException w:name="Grid Table 2 Accent 6" w:uiPriority="47"/>
+    <w:lsdException w:name="Grid Table 3 Accent 6" w:uiPriority="48"/>
+    <w:lsdException w:name="Grid Table 4 Accent 6" w:uiPriority="49"/>
+    <w:lsdException w:name="Grid Table 5 Dark Accent 6" w:uiPriority="50"/>
+    <w:lsdException w:name="Grid Table 6 Colorful Accent 6" w:uiPriority="51"/>
+    <w:lsdException w:name="Grid Table 7 Colorful Accent 6" w:uiPriority="52"/>
+    <w:lsdException w:name="List Table 1 Light" w:uiPriority="46"/>
+    <w:lsdException w:name="List Table 2" w:uiPriority="47"/>
+    <w:lsdException w:name="List Table 3" w:uiPriority="48"/>
+    <w:lsdException w:name="List Table 4" w:uiPriority="49"/>
+    <w:lsdException w:name="List Table 5 Dark" w:uiPriority="50"/>
+    <w:lsdException w:name="List Table 6 Colorful" w:uiPriority="51"/>
+    <w:lsdException w:name="List Table 7 Colorful" w:uiPriority="52"/>
+    <w:lsdException w:name="List Table 1 Light Accent 1" w:uiPriority="46"/>
+    <w:lsdException w:name="List Table 2 Accent 1" w:uiPriority="47"/>
+    <w:lsdException w:name="List Table 3 Accent 1" w:uiPriority="48"/>
+    <w:lsdException w:name="List Table 4 Accent 1" w:uiPriority="49"/>
+    <w:lsdException w:name="List Table 5 Dark Accent 1" w:uiPriority="50"/>
+    <w:lsdException w:name="List Table 6 Colorful Accent 1" w:uiPriority="51"/>
+    <w:lsdException w:name="List Table 7 Colorful Accent 1" w:uiPriority="52"/>
+    <w:lsdException w:name="List Table 1 Light Accent 2" w:uiPriority="46"/>
+    <w:lsdException w:name="List Table 2 Accent 2" w:uiPriority="47"/>
+    <w:lsdException w:name="List Table 3 Accent 2" w:uiPriority="48"/>
+    <w:lsdException w:name="List Table 4 Accent 2" w:uiPriority="49"/>
+    <w:lsdException w:name="List Table 5 Dark Accent 2" w:uiPriority="50"/>
+    <w:lsdException w:name="List Table 6 Colorful Accent 2" w:uiPriority="51"/>
+    <w:lsdException w:name="List Table 7 Colorful Accent 2" w:uiPriority="52"/>
+    <w:lsdException w:name="List Table 1 Light Accent 3" w:uiPriority="46"/>
+    <w:lsdException w:name="List Table 2 Accent 3" w:uiPriority="47"/>
+    <w:lsdException w:name="List Table 3 Accent 3" w:uiPriority="48"/>
+    <w:lsdException w:name="List Table 4 Accent 3" w:uiPriority="49"/>
+    <w:lsdException w:name="List Table 5 Dark Accent 3" w:uiPriority="50"/>
+    <w:lsdException w:name="List Table 6 Colorful Accent 3" w:uiPriority="51"/>
+    <w:lsdException w:name="List Table 7 Colorful Accent 3" w:uiPriority="52"/>
+    <w:lsdException w:name="List Table 1 Light Accent 4" w:uiPriority="46"/>
+    <w:lsdException w:name="List Table 2 Accent 4" w:uiPriority="47"/>
+    <w:lsdException w:name="List Table 3 Accent 4" w:uiPriority="48"/>
+    <w:lsdException w:name="List Table 4 Accent 4" w:uiPriority="49"/>
+    <w:lsdException w:name="List Table 5 Dark Accent 4" w:uiPriority="50"/>
+    <w:lsdException w:name="List Table 6 Colorful Accent 4" w:uiPriority="51"/>
+    <w:lsdException w:name="List Table 7 Colorful Accent 4" w:uiPriority="52"/>
+    <w:lsdException w:name="List Table 1 Light Accent 5" w:uiPriority="46"/>
+    <w:lsdException w:name="List Table 2 Accent 5" w:uiPriority="47"/>
+    <w:lsdException w:name="List Table 3 Accent 5" w:uiPriority="48"/>
+    <w:lsdException w:name="List Table 4 Accent 5" w:uiPriority="49"/>
+    <w:lsdException w:name="List Table 5 Dark Accent 5" w:uiPriority="50"/>
+    <w:lsdException w:name="List Table 6 Colorful Accent 5" w:uiPriority="51"/>
+    <w:lsdException w:name="List Table 7 Colorful Accent 5" w:uiPriority="52"/>
+    <w:lsdException w:name="List Table 1 Light Accent 6" w:uiPriority="46"/>
+    <w:lsdException w:name="List Table 2 Accent 6" w:uiPriority="47"/>
+    <w:lsdException w:name="List Table 3 Accent 6" w:uiPriority="48"/>
+    <w:lsdException w:name="List Table 4 Accent 6" w:uiPriority="49"/>
+    <w:lsdException w:name="List Table 5 Dark Accent 6" w:uiPriority="50"/>
+    <w:lsdException w:name="List Table 6 Colorful Accent 6" w:uiPriority="51"/>
+    <w:lsdException w:name="List Table 7 Colorful Accent 6" w:uiPriority="52"/>
+    <w:lsdException w:name="Mention" w:semiHidden="1" w:uiPriority="99" w:unhideWhenUsed="1"/>
+    <w:lsdException w:name="Smart Hyperlink" w:semiHidden="1" w:uiPriority="99" w:unhideWhenUsed="1"/>
+    <w:lsdException w:name="Hashtag" w:semiHidden="1" w:uiPriority="99" w:unhideWhenUsed="1"/>
+    <w:lsdException w:name="Unresolved Mention" w:semiHidden="1" w:uiPriority="99" w:unhideWhenUsed="1"/>
+    <w:lsdException w:name="Smart Link" w:semiHidden="1" w:uiPriority="99" w:unhideWhenUsed="1"/>
+  </w:latentStyles>
+  <w:style w:type="paragraph" w:default="1" w:styleId="Normal">
     <w:name w:val="Normal"/>
     <w:qFormat/>
   </w:style>
-  <w:style w:styleId="BodyText" w:type="paragraph">
-    <w:name w:val="Body Text"/>
-    <w:basedOn w:val="Normal"/>
-    <w:link w:val="BodyTextChar"/>
-    <w:qFormat/>
-    <w:pPr>
-      <w:spacing w:after="180" w:before="180"/>
-    </w:pPr>
-  </w:style>
-  <w:style w:customStyle="1" w:styleId="FirstParagraph" w:type="paragraph">
-    <w:name w:val="First Paragraph"/>
-    <w:basedOn w:val="BodyText"/>
-    <w:next w:val="BodyText"/>
-    <w:qFormat/>
-  </w:style>
-  <w:style w:customStyle="1" w:styleId="Compact" w:type="paragraph">
-    <w:name w:val="Compact"/>
-    <w:basedOn w:val="BodyText"/>
-    <w:qFormat/>
-    <w:pPr>
-      <w:spacing w:after="36" w:before="36"/>
-    </w:pPr>
-  </w:style>
-  <w:style w:styleId="Title" w:type="paragraph">
-    <w:name w:val="Title"/>
-    <w:basedOn w:val="Normal"/>
-    <w:next w:val="BodyText"/>
-    <w:link w:val="TitleChar"/>
-    <w:uiPriority w:val="10"/>
-    <w:qFormat/>
-    <w:rsid w:val="00A10FD9"/>
-    <w:pPr>
-      <w:spacing w:after="80" w:line="240" w:lineRule="auto"/>
-      <w:contextualSpacing/>
-      <w:jc w:val="center"/>
-    </w:pPr>
-    <w:rPr>
-      <w:rFonts w:asciiTheme="majorHAnsi" w:cstheme="majorBidi" w:eastAsiaTheme="majorEastAsia" w:hAnsiTheme="majorHAnsi"/>
-      <w:sz w:val="56"/>
-      <w:szCs w:val="56"/>
-    </w:rPr>
-  </w:style>
-  <w:style w:customStyle="1" w:styleId="TitleChar" w:type="character">
-    <w:name w:val="Title Char"/>
-    <w:basedOn w:val="DefaultParagraphFont"/>
-    <w:link w:val="Title"/>
-    <w:uiPriority w:val="10"/>
-    <w:rsid w:val="00A10FD9"/>
-    <w:rPr>
-      <w:rFonts w:asciiTheme="majorHAnsi" w:cstheme="majorBidi" w:eastAsiaTheme="majorEastAsia" w:hAnsiTheme="majorHAnsi"/>
-      <w:sz w:val="56"/>
-      <w:szCs w:val="56"/>
-    </w:rPr>
-  </w:style>
-  <w:style w:styleId="Subtitle" w:type="paragraph">
-    <w:name w:val="Subtitle"/>
-    <w:basedOn w:val="Title"/>
-    <w:next w:val="BodyText"/>
-    <w:link w:val="SubtitleChar"/>
-    <w:uiPriority w:val="11"/>
-    <w:qFormat/>
-    <w:rsid w:val="00A10FD9"/>
-    <w:pPr>
-      <w:numPr>
-        <w:ilvl w:val="1"/>
-      </w:numPr>
-    </w:pPr>
-    <w:rPr>
-      <w:rFonts w:cstheme="majorBidi" w:eastAsiaTheme="majorEastAsia"/>
-      <w:spacing w:val="15"/>
-      <w:sz w:val="28"/>
-      <w:szCs w:val="28"/>
-    </w:rPr>
-  </w:style>
-  <w:style w:customStyle="1" w:styleId="SubtitleChar" w:type="character">
-    <w:name w:val="Subtitle Char"/>
-    <w:basedOn w:val="DefaultParagraphFont"/>
-    <w:link w:val="Subtitle"/>
-    <w:uiPriority w:val="11"/>
-    <w:rsid w:val="00A10FD9"/>
-    <w:rPr>
-      <w:rFonts w:cstheme="majorBidi" w:eastAsiaTheme="majorEastAsia"/>
-      <w:color w:themeColor="text1" w:themeTint="A6" w:val="595959"/>
-      <w:spacing w:val="15"/>
-      <w:sz w:val="28"/>
-      <w:szCs w:val="28"/>
-    </w:rPr>
-  </w:style>
-  <w:style w:customStyle="1" w:styleId="Author" w:type="paragraph">
-    <w:name w:val="Author"/>
-    <w:basedOn w:val="Title"/>
-    <w:next w:val="BodyText"/>
-    <w:qFormat/>
-    <w:pPr>
-      <w:keepNext/>
-      <w:keepLines/>
-    </w:pPr>
-    <w:rPr>
-      <w:sz w:val="24"/>
-      <w:szCs w:val="24"/>
-    </w:rPr>
-  </w:style>
-  <w:style w:styleId="Date" w:type="paragraph">
-    <w:name w:val="Date"/>
-    <w:basedOn w:val="Title"/>
-    <w:next w:val="BodyText"/>
-    <w:qFormat/>
-    <w:pPr>
-      <w:keepNext/>
-      <w:keepLines/>
-    </w:pPr>
-    <w:rPr>
-      <w:sz w:val="24"/>
-      <w:szCs w:val="24"/>
-    </w:rPr>
-  </w:style>
-  <w:style w:customStyle="1" w:styleId="AbstractTitle" w:type="paragraph">
-    <w:name w:val="Abstract Title"/>
-    <w:basedOn w:val="Normal"/>
-    <w:next w:val="Abstract"/>
-    <w:qFormat/>
-    <w:pPr>
-      <w:keepNext/>
-      <w:keepLines/>
-      <w:spacing w:after="0" w:before="300"/>
-      <w:jc w:val="center"/>
-    </w:pPr>
-    <w:rPr>
-      <w:b/>
-      <w:sz w:val="20"/>
-      <w:szCs w:val="20"/>
-    </w:rPr>
-  </w:style>
-  <w:style w:customStyle="1" w:styleId="Abstract" w:type="paragraph">
-    <w:name w:val="Abstract"/>
-    <w:basedOn w:val="Normal"/>
-    <w:next w:val="BodyText"/>
-    <w:qFormat/>
-    <w:pPr>
-      <w:keepNext/>
-      <w:keepLines/>
-      <w:spacing w:after="300" w:before="100"/>
-    </w:pPr>
-    <w:rPr>
-      <w:sz w:val="20"/>
-      <w:szCs w:val="20"/>
-    </w:rPr>
-  </w:style>
-  <w:style w:styleId="Bibliography" w:type="paragraph">
-    <w:name w:val="Bibliography"/>
-    <w:basedOn w:val="Normal"/>
-    <w:next w:val="Bibliography"/>
-    <w:qFormat/>
-    <w:pPr/>
-    <w:rPr/>
-  </w:style>
-  <w:style w:styleId="Heading1" w:type="paragraph">
+  <w:style w:type="paragraph" w:styleId="Heading1">
     <w:name w:val="heading 1"/>
     <w:basedOn w:val="Normal"/>
     <w:next w:val="BodyText"/>
@@ -1761,17 +1520,17 @@
     <w:pPr>
       <w:keepNext/>
       <w:keepLines/>
-      <w:spacing w:after="80" w:before="360"/>
+      <w:spacing w:before="360" w:after="80"/>
       <w:outlineLvl w:val="0"/>
     </w:pPr>
     <w:rPr>
-      <w:rFonts w:asciiTheme="majorHAnsi" w:cstheme="majorBidi" w:eastAsiaTheme="majorEastAsia" w:hAnsiTheme="majorHAnsi"/>
-      <w:color w:themeColor="accent1" w:themeShade="BF" w:val="0F4761"/>
+      <w:rFonts w:asciiTheme="majorHAnsi" w:eastAsiaTheme="majorEastAsia" w:hAnsiTheme="majorHAnsi" w:cstheme="majorBidi"/>
+      <w:color w:val="0F4761" w:themeColor="accent1" w:themeShade="BF"/>
       <w:sz w:val="40"/>
       <w:szCs w:val="40"/>
     </w:rPr>
   </w:style>
-  <w:style w:styleId="Heading2" w:type="paragraph">
+  <w:style w:type="paragraph" w:styleId="Heading2">
     <w:name w:val="heading 2"/>
     <w:basedOn w:val="Normal"/>
     <w:next w:val="BodyText"/>
@@ -1784,17 +1543,17 @@
     <w:pPr>
       <w:keepNext/>
       <w:keepLines/>
-      <w:spacing w:after="80" w:before="160"/>
+      <w:spacing w:before="160" w:after="80"/>
       <w:outlineLvl w:val="1"/>
     </w:pPr>
     <w:rPr>
-      <w:rFonts w:asciiTheme="majorHAnsi" w:cstheme="majorBidi" w:eastAsiaTheme="majorEastAsia" w:hAnsiTheme="majorHAnsi"/>
-      <w:color w:themeColor="accent1" w:themeShade="BF" w:val="0F4761"/>
+      <w:rFonts w:asciiTheme="majorHAnsi" w:eastAsiaTheme="majorEastAsia" w:hAnsiTheme="majorHAnsi" w:cstheme="majorBidi"/>
+      <w:color w:val="0F4761" w:themeColor="accent1" w:themeShade="BF"/>
       <w:sz w:val="32"/>
       <w:szCs w:val="32"/>
     </w:rPr>
   </w:style>
-  <w:style w:styleId="Heading3" w:type="paragraph">
+  <w:style w:type="paragraph" w:styleId="Heading3">
     <w:name w:val="heading 3"/>
     <w:basedOn w:val="Normal"/>
     <w:next w:val="BodyText"/>
@@ -1807,17 +1566,17 @@
     <w:pPr>
       <w:keepNext/>
       <w:keepLines/>
-      <w:spacing w:after="80" w:before="160"/>
+      <w:spacing w:before="160" w:after="80"/>
       <w:outlineLvl w:val="2"/>
     </w:pPr>
     <w:rPr>
-      <w:rFonts w:cstheme="majorBidi" w:eastAsiaTheme="majorEastAsia"/>
-      <w:color w:themeColor="accent1" w:themeShade="BF" w:val="0F4761"/>
+      <w:rFonts w:eastAsiaTheme="majorEastAsia" w:cstheme="majorBidi"/>
+      <w:color w:val="0F4761" w:themeColor="accent1" w:themeShade="BF"/>
       <w:sz w:val="28"/>
       <w:szCs w:val="28"/>
     </w:rPr>
   </w:style>
-  <w:style w:styleId="Heading4" w:type="paragraph">
+  <w:style w:type="paragraph" w:styleId="Heading4">
     <w:name w:val="heading 4"/>
     <w:basedOn w:val="Normal"/>
     <w:next w:val="BodyText"/>
@@ -1830,17 +1589,17 @@
     <w:pPr>
       <w:keepNext/>
       <w:keepLines/>
-      <w:spacing w:after="40" w:before="80"/>
+      <w:spacing w:before="80" w:after="40"/>
       <w:outlineLvl w:val="3"/>
     </w:pPr>
     <w:rPr>
-      <w:rFonts w:cstheme="majorBidi" w:eastAsiaTheme="majorEastAsia"/>
+      <w:rFonts w:eastAsiaTheme="majorEastAsia" w:cstheme="majorBidi"/>
       <w:i/>
       <w:iCs/>
-      <w:color w:themeColor="accent1" w:themeShade="BF" w:val="0F4761"/>
-    </w:rPr>
-  </w:style>
-  <w:style w:styleId="Heading5" w:type="paragraph">
+      <w:color w:val="0F4761" w:themeColor="accent1" w:themeShade="BF"/>
+    </w:rPr>
+  </w:style>
+  <w:style w:type="paragraph" w:styleId="Heading5">
     <w:name w:val="heading 5"/>
     <w:basedOn w:val="Normal"/>
     <w:next w:val="BodyText"/>
@@ -1853,15 +1612,15 @@
     <w:pPr>
       <w:keepNext/>
       <w:keepLines/>
-      <w:spacing w:after="40" w:before="80"/>
+      <w:spacing w:before="80" w:after="40"/>
       <w:outlineLvl w:val="4"/>
     </w:pPr>
     <w:rPr>
-      <w:rFonts w:cstheme="majorBidi" w:eastAsiaTheme="majorEastAsia"/>
-      <w:color w:themeColor="accent1" w:themeShade="BF" w:val="0F4761"/>
-    </w:rPr>
-  </w:style>
-  <w:style w:styleId="Heading6" w:type="paragraph">
+      <w:rFonts w:eastAsiaTheme="majorEastAsia" w:cstheme="majorBidi"/>
+      <w:color w:val="0F4761" w:themeColor="accent1" w:themeShade="BF"/>
+    </w:rPr>
+  </w:style>
+  <w:style w:type="paragraph" w:styleId="Heading6">
     <w:name w:val="heading 6"/>
     <w:basedOn w:val="Normal"/>
     <w:next w:val="BodyText"/>
@@ -1874,17 +1633,17 @@
     <w:pPr>
       <w:keepNext/>
       <w:keepLines/>
-      <w:spacing w:after="0" w:before="40"/>
+      <w:spacing w:before="40" w:after="0"/>
       <w:outlineLvl w:val="5"/>
     </w:pPr>
     <w:rPr>
-      <w:rFonts w:cstheme="majorBidi" w:eastAsiaTheme="majorEastAsia"/>
+      <w:rFonts w:eastAsiaTheme="majorEastAsia" w:cstheme="majorBidi"/>
       <w:i/>
       <w:iCs/>
-      <w:color w:themeColor="text1" w:themeTint="A6" w:val="595959"/>
-    </w:rPr>
-  </w:style>
-  <w:style w:styleId="Heading7" w:type="paragraph">
+      <w:color w:val="595959" w:themeColor="text1" w:themeTint="A6"/>
+    </w:rPr>
+  </w:style>
+  <w:style w:type="paragraph" w:styleId="Heading7">
     <w:name w:val="heading 7"/>
     <w:basedOn w:val="Normal"/>
     <w:next w:val="BodyText"/>
@@ -1897,15 +1656,15 @@
     <w:pPr>
       <w:keepNext/>
       <w:keepLines/>
-      <w:spacing w:after="0" w:before="40"/>
+      <w:spacing w:before="40" w:after="0"/>
       <w:outlineLvl w:val="6"/>
     </w:pPr>
     <w:rPr>
-      <w:rFonts w:cstheme="majorBidi" w:eastAsiaTheme="majorEastAsia"/>
-      <w:color w:themeColor="text1" w:themeTint="A6" w:val="595959"/>
-    </w:rPr>
-  </w:style>
-  <w:style w:styleId="Heading8" w:type="paragraph">
+      <w:rFonts w:eastAsiaTheme="majorEastAsia" w:cstheme="majorBidi"/>
+      <w:color w:val="595959" w:themeColor="text1" w:themeTint="A6"/>
+    </w:rPr>
+  </w:style>
+  <w:style w:type="paragraph" w:styleId="Heading8">
     <w:name w:val="heading 8"/>
     <w:basedOn w:val="Normal"/>
     <w:next w:val="BodyText"/>
@@ -1922,13 +1681,13 @@
       <w:outlineLvl w:val="7"/>
     </w:pPr>
     <w:rPr>
-      <w:rFonts w:cstheme="majorBidi" w:eastAsiaTheme="majorEastAsia"/>
+      <w:rFonts w:eastAsiaTheme="majorEastAsia" w:cstheme="majorBidi"/>
       <w:i/>
       <w:iCs/>
-      <w:color w:themeColor="text1" w:themeTint="D8" w:val="272727"/>
-    </w:rPr>
-  </w:style>
-  <w:style w:styleId="Heading9" w:type="paragraph">
+      <w:color w:val="272727" w:themeColor="text1" w:themeTint="D8"/>
+    </w:rPr>
+  </w:style>
+  <w:style w:type="paragraph" w:styleId="Heading9">
     <w:name w:val="heading 9"/>
     <w:basedOn w:val="Normal"/>
     <w:next w:val="BodyText"/>
@@ -1945,24 +1704,202 @@
       <w:outlineLvl w:val="8"/>
     </w:pPr>
     <w:rPr>
-      <w:rFonts w:cstheme="majorBidi" w:eastAsiaTheme="majorEastAsia"/>
-      <w:color w:themeColor="text1" w:themeTint="D8" w:val="272727"/>
-    </w:rPr>
-  </w:style>
-  <w:style w:customStyle="1" w:styleId="Heading1Char" w:type="character">
+      <w:rFonts w:eastAsiaTheme="majorEastAsia" w:cstheme="majorBidi"/>
+      <w:color w:val="272727" w:themeColor="text1" w:themeTint="D8"/>
+    </w:rPr>
+  </w:style>
+  <w:style w:type="character" w:default="1" w:styleId="DefaultParagraphFont">
+    <w:name w:val="Default Paragraph Font"/>
+    <w:uiPriority w:val="1"/>
+    <w:semiHidden/>
+    <w:unhideWhenUsed/>
+  </w:style>
+  <w:style w:type="table" w:default="1" w:styleId="TableNormal">
+    <w:name w:val="Normal Table"/>
+    <w:uiPriority w:val="99"/>
+    <w:semiHidden/>
+    <w:unhideWhenUsed/>
+    <w:tblPr>
+      <w:tblInd w:w="0" w:type="dxa"/>
+      <w:tblCellMar>
+        <w:top w:w="0" w:type="dxa"/>
+        <w:left w:w="108" w:type="dxa"/>
+        <w:bottom w:w="0" w:type="dxa"/>
+        <w:right w:w="108" w:type="dxa"/>
+      </w:tblCellMar>
+    </w:tblPr>
+  </w:style>
+  <w:style w:type="numbering" w:default="1" w:styleId="NoList">
+    <w:name w:val="No List"/>
+    <w:uiPriority w:val="99"/>
+    <w:semiHidden/>
+    <w:unhideWhenUsed/>
+  </w:style>
+  <w:style w:type="paragraph" w:styleId="BodyText">
+    <w:name w:val="Body Text"/>
+    <w:basedOn w:val="Normal"/>
+    <w:qFormat/>
+    <w:pPr>
+      <w:spacing w:before="180" w:after="180"/>
+    </w:pPr>
+  </w:style>
+  <w:style w:type="paragraph" w:customStyle="1" w:styleId="FirstParagraph">
+    <w:name w:val="First Paragraph"/>
+    <w:basedOn w:val="BodyText"/>
+    <w:next w:val="BodyText"/>
+    <w:qFormat/>
+  </w:style>
+  <w:style w:type="paragraph" w:customStyle="1" w:styleId="Compact">
+    <w:name w:val="Compact"/>
+    <w:basedOn w:val="BodyText"/>
+    <w:qFormat/>
+    <w:pPr>
+      <w:spacing w:before="36" w:after="36"/>
+    </w:pPr>
+  </w:style>
+  <w:style w:type="paragraph" w:styleId="Title">
+    <w:name w:val="Title"/>
+    <w:basedOn w:val="Normal"/>
+    <w:next w:val="BodyText"/>
+    <w:link w:val="TitleChar"/>
+    <w:uiPriority w:val="10"/>
+    <w:qFormat/>
+    <w:rsid w:val="00A10FD9"/>
+    <w:pPr>
+      <w:spacing w:after="80"/>
+      <w:contextualSpacing/>
+      <w:jc w:val="center"/>
+    </w:pPr>
+    <w:rPr>
+      <w:rFonts w:asciiTheme="majorHAnsi" w:eastAsiaTheme="majorEastAsia" w:hAnsiTheme="majorHAnsi" w:cstheme="majorBidi"/>
+      <w:sz w:val="56"/>
+      <w:szCs w:val="56"/>
+    </w:rPr>
+  </w:style>
+  <w:style w:type="character" w:customStyle="1" w:styleId="TitleChar">
+    <w:name w:val="Title Char"/>
+    <w:basedOn w:val="DefaultParagraphFont"/>
+    <w:link w:val="Title"/>
+    <w:uiPriority w:val="10"/>
+    <w:rsid w:val="00A10FD9"/>
+    <w:rPr>
+      <w:rFonts w:asciiTheme="majorHAnsi" w:eastAsiaTheme="majorEastAsia" w:hAnsiTheme="majorHAnsi" w:cstheme="majorBidi"/>
+      <w:sz w:val="56"/>
+      <w:szCs w:val="56"/>
+    </w:rPr>
+  </w:style>
+  <w:style w:type="paragraph" w:styleId="Subtitle">
+    <w:name w:val="Subtitle"/>
+    <w:basedOn w:val="Title"/>
+    <w:next w:val="BodyText"/>
+    <w:link w:val="SubtitleChar"/>
+    <w:uiPriority w:val="11"/>
+    <w:qFormat/>
+    <w:rsid w:val="00A10FD9"/>
+    <w:pPr>
+      <w:numPr>
+        <w:ilvl w:val="1"/>
+      </w:numPr>
+    </w:pPr>
+    <w:rPr>
+      <w:spacing w:val="15"/>
+      <w:sz w:val="28"/>
+      <w:szCs w:val="28"/>
+    </w:rPr>
+  </w:style>
+  <w:style w:type="character" w:customStyle="1" w:styleId="SubtitleChar">
+    <w:name w:val="Subtitle Char"/>
+    <w:basedOn w:val="DefaultParagraphFont"/>
+    <w:link w:val="Subtitle"/>
+    <w:uiPriority w:val="11"/>
+    <w:rsid w:val="00A10FD9"/>
+    <w:rPr>
+      <w:rFonts w:eastAsiaTheme="majorEastAsia" w:cstheme="majorBidi"/>
+      <w:color w:val="595959" w:themeColor="text1" w:themeTint="A6"/>
+      <w:spacing w:val="15"/>
+      <w:sz w:val="28"/>
+      <w:szCs w:val="28"/>
+    </w:rPr>
+  </w:style>
+  <w:style w:type="paragraph" w:customStyle="1" w:styleId="Author">
+    <w:name w:val="Author"/>
+    <w:basedOn w:val="Title"/>
+    <w:next w:val="BodyText"/>
+    <w:qFormat/>
+    <w:pPr>
+      <w:keepNext/>
+      <w:keepLines/>
+    </w:pPr>
+    <w:rPr>
+      <w:sz w:val="24"/>
+      <w:szCs w:val="24"/>
+    </w:rPr>
+  </w:style>
+  <w:style w:type="paragraph" w:styleId="Date">
+    <w:name w:val="Date"/>
+    <w:basedOn w:val="Title"/>
+    <w:next w:val="BodyText"/>
+    <w:qFormat/>
+    <w:pPr>
+      <w:keepNext/>
+      <w:keepLines/>
+    </w:pPr>
+    <w:rPr>
+      <w:sz w:val="24"/>
+      <w:szCs w:val="24"/>
+    </w:rPr>
+  </w:style>
+  <w:style w:type="paragraph" w:customStyle="1" w:styleId="AbstractTitle">
+    <w:name w:val="Abstract Title"/>
+    <w:basedOn w:val="Normal"/>
+    <w:next w:val="Abstract"/>
+    <w:qFormat/>
+    <w:pPr>
+      <w:keepNext/>
+      <w:keepLines/>
+      <w:spacing w:before="300" w:after="0"/>
+      <w:jc w:val="center"/>
+    </w:pPr>
+    <w:rPr>
+      <w:b/>
+      <w:sz w:val="20"/>
+      <w:szCs w:val="20"/>
+    </w:rPr>
+  </w:style>
+  <w:style w:type="paragraph" w:customStyle="1" w:styleId="Abstract">
+    <w:name w:val="Abstract"/>
+    <w:basedOn w:val="Normal"/>
+    <w:next w:val="BodyText"/>
+    <w:qFormat/>
+    <w:pPr>
+      <w:keepNext/>
+      <w:keepLines/>
+      <w:spacing w:before="100" w:after="300"/>
+    </w:pPr>
+    <w:rPr>
+      <w:sz w:val="20"/>
+      <w:szCs w:val="20"/>
+    </w:rPr>
+  </w:style>
+  <w:style w:type="paragraph" w:styleId="Bibliography">
+    <w:name w:val="Bibliography"/>
+    <w:basedOn w:val="Normal"/>
+    <w:qFormat/>
+  </w:style>
+  <w:style w:type="character" w:customStyle="1" w:styleId="Heading1Char">
     <w:name w:val="Heading 1 Char"/>
     <w:basedOn w:val="DefaultParagraphFont"/>
     <w:link w:val="Heading1"/>
     <w:uiPriority w:val="9"/>
     <w:rsid w:val="00A10FD9"/>
     <w:rPr>
-      <w:rFonts w:asciiTheme="majorHAnsi" w:cstheme="majorBidi" w:eastAsiaTheme="majorEastAsia" w:hAnsiTheme="majorHAnsi"/>
-      <w:color w:themeColor="accent1" w:themeShade="BF" w:val="0F4761"/>
+      <w:rFonts w:asciiTheme="majorHAnsi" w:eastAsiaTheme="majorEastAsia" w:hAnsiTheme="majorHAnsi" w:cstheme="majorBidi"/>
+      <w:color w:val="0F4761" w:themeColor="accent1" w:themeShade="BF"/>
       <w:sz w:val="40"/>
       <w:szCs w:val="40"/>
     </w:rPr>
   </w:style>
-  <w:style w:customStyle="1" w:styleId="Heading2Char" w:type="character">
+  <w:style w:type="character" w:customStyle="1" w:styleId="Heading2Char">
     <w:name w:val="Heading 2 Char"/>
     <w:basedOn w:val="DefaultParagraphFont"/>
     <w:link w:val="Heading2"/>
@@ -1970,13 +1907,13 @@
     <w:semiHidden/>
     <w:rsid w:val="00A10FD9"/>
     <w:rPr>
-      <w:rFonts w:asciiTheme="majorHAnsi" w:cstheme="majorBidi" w:eastAsiaTheme="majorEastAsia" w:hAnsiTheme="majorHAnsi"/>
-      <w:color w:themeColor="accent1" w:themeShade="BF" w:val="0F4761"/>
+      <w:rFonts w:asciiTheme="majorHAnsi" w:eastAsiaTheme="majorEastAsia" w:hAnsiTheme="majorHAnsi" w:cstheme="majorBidi"/>
+      <w:color w:val="0F4761" w:themeColor="accent1" w:themeShade="BF"/>
       <w:sz w:val="32"/>
       <w:szCs w:val="32"/>
     </w:rPr>
   </w:style>
-  <w:style w:customStyle="1" w:styleId="Heading3Char" w:type="character">
+  <w:style w:type="character" w:customStyle="1" w:styleId="Heading3Char">
     <w:name w:val="Heading 3 Char"/>
     <w:basedOn w:val="DefaultParagraphFont"/>
     <w:link w:val="Heading3"/>
@@ -1984,13 +1921,13 @@
     <w:semiHidden/>
     <w:rsid w:val="00A10FD9"/>
     <w:rPr>
-      <w:rFonts w:cstheme="majorBidi" w:eastAsiaTheme="majorEastAsia"/>
-      <w:color w:themeColor="accent1" w:themeShade="BF" w:val="0F4761"/>
+      <w:rFonts w:eastAsiaTheme="majorEastAsia" w:cstheme="majorBidi"/>
+      <w:color w:val="0F4761" w:themeColor="accent1" w:themeShade="BF"/>
       <w:sz w:val="28"/>
       <w:szCs w:val="28"/>
     </w:rPr>
   </w:style>
-  <w:style w:customStyle="1" w:styleId="Heading4Char" w:type="character">
+  <w:style w:type="character" w:customStyle="1" w:styleId="Heading4Char">
     <w:name w:val="Heading 4 Char"/>
     <w:basedOn w:val="DefaultParagraphFont"/>
     <w:link w:val="Heading4"/>
@@ -1998,13 +1935,13 @@
     <w:semiHidden/>
     <w:rsid w:val="00A10FD9"/>
     <w:rPr>
-      <w:rFonts w:cstheme="majorBidi" w:eastAsiaTheme="majorEastAsia"/>
+      <w:rFonts w:eastAsiaTheme="majorEastAsia" w:cstheme="majorBidi"/>
       <w:i/>
       <w:iCs/>
-      <w:color w:themeColor="accent1" w:themeShade="BF" w:val="0F4761"/>
-    </w:rPr>
-  </w:style>
-  <w:style w:customStyle="1" w:styleId="Heading5Char" w:type="character">
+      <w:color w:val="0F4761" w:themeColor="accent1" w:themeShade="BF"/>
+    </w:rPr>
+  </w:style>
+  <w:style w:type="character" w:customStyle="1" w:styleId="Heading5Char">
     <w:name w:val="Heading 5 Char"/>
     <w:basedOn w:val="DefaultParagraphFont"/>
     <w:link w:val="Heading5"/>
@@ -2012,11 +1949,11 @@
     <w:semiHidden/>
     <w:rsid w:val="00A10FD9"/>
     <w:rPr>
-      <w:rFonts w:cstheme="majorBidi" w:eastAsiaTheme="majorEastAsia"/>
-      <w:color w:themeColor="accent1" w:themeShade="BF" w:val="0F4761"/>
-    </w:rPr>
-  </w:style>
-  <w:style w:customStyle="1" w:styleId="Heading6Char" w:type="character">
+      <w:rFonts w:eastAsiaTheme="majorEastAsia" w:cstheme="majorBidi"/>
+      <w:color w:val="0F4761" w:themeColor="accent1" w:themeShade="BF"/>
+    </w:rPr>
+  </w:style>
+  <w:style w:type="character" w:customStyle="1" w:styleId="Heading6Char">
     <w:name w:val="Heading 6 Char"/>
     <w:basedOn w:val="DefaultParagraphFont"/>
     <w:link w:val="Heading6"/>
@@ -2024,13 +1961,13 @@
     <w:semiHidden/>
     <w:rsid w:val="00A10FD9"/>
     <w:rPr>
-      <w:rFonts w:cstheme="majorBidi" w:eastAsiaTheme="majorEastAsia"/>
+      <w:rFonts w:eastAsiaTheme="majorEastAsia" w:cstheme="majorBidi"/>
       <w:i/>
       <w:iCs/>
-      <w:color w:themeColor="text1" w:themeTint="A6" w:val="595959"/>
-    </w:rPr>
-  </w:style>
-  <w:style w:customStyle="1" w:styleId="Heading7Char" w:type="character">
+      <w:color w:val="595959" w:themeColor="text1" w:themeTint="A6"/>
+    </w:rPr>
+  </w:style>
+  <w:style w:type="character" w:customStyle="1" w:styleId="Heading7Char">
     <w:name w:val="Heading 7 Char"/>
     <w:basedOn w:val="DefaultParagraphFont"/>
     <w:link w:val="Heading7"/>
@@ -2038,11 +1975,11 @@
     <w:semiHidden/>
     <w:rsid w:val="00A10FD9"/>
     <w:rPr>
-      <w:rFonts w:cstheme="majorBidi" w:eastAsiaTheme="majorEastAsia"/>
-      <w:color w:themeColor="text1" w:themeTint="A6" w:val="595959"/>
-    </w:rPr>
-  </w:style>
-  <w:style w:customStyle="1" w:styleId="Heading8Char" w:type="character">
+      <w:rFonts w:eastAsiaTheme="majorEastAsia" w:cstheme="majorBidi"/>
+      <w:color w:val="595959" w:themeColor="text1" w:themeTint="A6"/>
+    </w:rPr>
+  </w:style>
+  <w:style w:type="character" w:customStyle="1" w:styleId="Heading8Char">
     <w:name w:val="Heading 8 Char"/>
     <w:basedOn w:val="DefaultParagraphFont"/>
     <w:link w:val="Heading8"/>
@@ -2050,13 +1987,13 @@
     <w:semiHidden/>
     <w:rsid w:val="00A10FD9"/>
     <w:rPr>
-      <w:rFonts w:cstheme="majorBidi" w:eastAsiaTheme="majorEastAsia"/>
+      <w:rFonts w:eastAsiaTheme="majorEastAsia" w:cstheme="majorBidi"/>
       <w:i/>
       <w:iCs/>
-      <w:color w:themeColor="text1" w:themeTint="D8" w:val="272727"/>
-    </w:rPr>
-  </w:style>
-  <w:style w:customStyle="1" w:styleId="Heading9Char" w:type="character">
+      <w:color w:val="272727" w:themeColor="text1" w:themeTint="D8"/>
+    </w:rPr>
+  </w:style>
+  <w:style w:type="character" w:customStyle="1" w:styleId="Heading9Char">
     <w:name w:val="Heading 9 Char"/>
     <w:basedOn w:val="DefaultParagraphFont"/>
     <w:link w:val="Heading9"/>
@@ -2064,11 +2001,11 @@
     <w:semiHidden/>
     <w:rsid w:val="00A10FD9"/>
     <w:rPr>
-      <w:rFonts w:cstheme="majorBidi" w:eastAsiaTheme="majorEastAsia"/>
-      <w:color w:themeColor="text1" w:themeTint="D8" w:val="272727"/>
-    </w:rPr>
-  </w:style>
-  <w:style w:styleId="BlockText" w:type="paragraph">
+      <w:rFonts w:eastAsiaTheme="majorEastAsia" w:cstheme="majorBidi"/>
+      <w:color w:val="272727" w:themeColor="text1" w:themeTint="D8"/>
+    </w:rPr>
+  </w:style>
+  <w:style w:type="paragraph" w:styleId="BlockText">
     <w:name w:val="Block Text"/>
     <w:basedOn w:val="BodyText"/>
     <w:next w:val="BodyText"/>
@@ -2076,19 +2013,18 @@
     <w:unhideWhenUsed/>
     <w:qFormat/>
     <w:pPr>
-      <w:spacing w:after="100" w:before="100"/>
-      <w:ind w:firstLine="0" w:left="480" w:right="480"/>
+      <w:spacing w:before="100" w:after="100"/>
+      <w:ind w:left="480" w:right="480"/>
     </w:pPr>
   </w:style>
-  <w:style w:styleId="FootnoteText" w:type="paragraph">
-    <w:name w:val="Footnote Text"/>
+  <w:style w:type="paragraph" w:styleId="FootnoteText">
+    <w:name w:val="footnote text"/>
     <w:basedOn w:val="Normal"/>
-    <w:next w:val="FootnoteText"/>
     <w:uiPriority w:val="9"/>
     <w:unhideWhenUsed/>
     <w:qFormat/>
   </w:style>
-  <w:style w:styleId="FootnoteBlockText" w:type="paragraph">
+  <w:style w:type="paragraph" w:customStyle="1" w:styleId="FootnoteBlockText">
     <w:name w:val="Footnote Block Text"/>
     <w:basedOn w:val="FootnoteText"/>
     <w:next w:val="FootnoteText"/>
@@ -2096,40 +2032,35 @@
     <w:unhideWhenUsed/>
     <w:qFormat/>
     <w:pPr>
-      <w:spacing w:after="100" w:before="100"/>
-      <w:ind w:firstLine="0" w:left="480" w:right="480"/>
+      <w:spacing w:before="100" w:after="100"/>
+      <w:ind w:left="480" w:right="480"/>
     </w:pPr>
   </w:style>
-  <w:style w:default="1" w:styleId="DefaultParagraphFont" w:type="character">
-    <w:name w:val="Default Paragraph Font"/>
-    <w:semiHidden/>
-    <w:unhideWhenUsed/>
-  </w:style>
-  <w:style w:default="1" w:styleId="Table" w:type="table">
+  <w:style w:type="table" w:customStyle="1" w:styleId="Table">
     <w:name w:val="Table"/>
-    <w:basedOn w:val="TableNormal"/>
     <w:semiHidden/>
     <w:unhideWhenUsed/>
     <w:qFormat/>
     <w:tblPr>
-      <w:tblInd w:type="dxa" w:w="0"/>
+      <w:tblInd w:w="0" w:type="dxa"/>
       <w:tblCellMar>
-        <w:top w:type="dxa" w:w="0"/>
-        <w:left w:type="dxa" w:w="108"/>
-        <w:bottom w:type="dxa" w:w="0"/>
-        <w:right w:type="dxa" w:w="108"/>
+        <w:top w:w="0" w:type="dxa"/>
+        <w:left w:w="108" w:type="dxa"/>
+        <w:bottom w:w="0" w:type="dxa"/>
+        <w:right w:w="108" w:type="dxa"/>
       </w:tblCellMar>
     </w:tblPr>
     <w:tblStylePr w:type="firstRow">
+      <w:tblPr/>
       <w:tcPr>
         <w:tcBorders>
-          <w:bottom w:val="single"/>
+          <w:bottom w:val="single" w:sz="0" w:space="0" w:color="auto"/>
         </w:tcBorders>
         <w:vAlign w:val="bottom"/>
       </w:tcPr>
     </w:tblStylePr>
   </w:style>
-  <w:style w:customStyle="1" w:styleId="DefinitionTerm" w:type="paragraph">
+  <w:style w:type="paragraph" w:customStyle="1" w:styleId="DefinitionTerm">
     <w:name w:val="Definition Term"/>
     <w:basedOn w:val="Normal"/>
     <w:next w:val="Definition"/>
@@ -2142,75 +2073,76 @@
       <w:b/>
     </w:rPr>
   </w:style>
-  <w:style w:customStyle="1" w:styleId="Definition" w:type="paragraph">
+  <w:style w:type="paragraph" w:customStyle="1" w:styleId="Definition">
     <w:name w:val="Definition"/>
     <w:basedOn w:val="Normal"/>
   </w:style>
-  <w:style w:styleId="Caption" w:type="paragraph">
-    <w:name w:val="Caption"/>
+  <w:style w:type="paragraph" w:styleId="Caption">
+    <w:name w:val="caption"/>
     <w:basedOn w:val="Normal"/>
-    <w:link w:val="BodyTextChar"/>
+    <w:link w:val="CaptionChar"/>
     <w:pPr>
-      <w:spacing w:after="120" w:before="0"/>
+      <w:spacing w:after="120"/>
     </w:pPr>
     <w:rPr>
       <w:i/>
     </w:rPr>
   </w:style>
-  <w:style w:customStyle="1" w:styleId="TableCaption" w:type="paragraph">
+  <w:style w:type="paragraph" w:customStyle="1" w:styleId="TableCaption">
     <w:name w:val="Table Caption"/>
     <w:basedOn w:val="Caption"/>
     <w:pPr>
       <w:keepNext/>
     </w:pPr>
   </w:style>
-  <w:style w:customStyle="1" w:styleId="ImageCaption" w:type="paragraph">
+  <w:style w:type="paragraph" w:customStyle="1" w:styleId="ImageCaption">
     <w:name w:val="Image Caption"/>
     <w:basedOn w:val="Caption"/>
   </w:style>
-  <w:style w:customStyle="1" w:styleId="Figure" w:type="paragraph">
+  <w:style w:type="paragraph" w:customStyle="1" w:styleId="Figure">
     <w:name w:val="Figure"/>
     <w:basedOn w:val="Normal"/>
   </w:style>
-  <w:style w:customStyle="1" w:styleId="CaptionedFigure" w:type="paragraph">
+  <w:style w:type="paragraph" w:customStyle="1" w:styleId="CaptionedFigure">
     <w:name w:val="Captioned Figure"/>
     <w:basedOn w:val="Figure"/>
     <w:pPr>
       <w:keepNext/>
     </w:pPr>
   </w:style>
-  <w:style w:customStyle="1" w:styleId="BodyTextChar" w:type="character">
-    <w:name w:val="Body Text Char"/>
+  <w:style w:type="character" w:customStyle="1" w:styleId="CaptionChar">
+    <w:name w:val="Caption Char"/>
     <w:basedOn w:val="DefaultParagraphFont"/>
-    <w:link w:val="BodyText"/>
-  </w:style>
-  <w:style w:customStyle="1" w:styleId="VerbatimChar" w:type="character">
+    <w:link w:val="Caption"/>
+  </w:style>
+  <w:style w:type="character" w:customStyle="1" w:styleId="VerbatimChar">
     <w:name w:val="Verbatim Char"/>
-    <w:basedOn w:val="BodyTextChar"/>
-    <w:rPr>
-      <w:rFonts w:ascii="Consolas" w:hAnsi="Consolas"/>
-      <w:sz w:val="22"/>
-    </w:rPr>
-  </w:style>
-  <w:style w:customStyle="1" w:styleId="SectionNumber" w:type="character">
+    <w:basedOn w:val="CaptionChar"/>
+    <w:link w:val="SourceCode"/>
+    <w:rPr>
+      <w:rFonts w:ascii="Consolas" w:hAnsi="Consolas"/>
+      <w:sz w:val="22"/>
+    </w:rPr>
+  </w:style>
+  <w:style w:type="character" w:customStyle="1" w:styleId="SectionNumber">
     <w:name w:val="Section Number"/>
-    <w:basedOn w:val="BodyTextChar"/>
-  </w:style>
-  <w:style w:styleId="FootnoteReference" w:type="character">
-    <w:name w:val="Footnote Reference"/>
-    <w:basedOn w:val="BodyTextChar"/>
+    <w:basedOn w:val="CaptionChar"/>
+  </w:style>
+  <w:style w:type="character" w:styleId="FootnoteReference">
+    <w:name w:val="footnote reference"/>
+    <w:basedOn w:val="CaptionChar"/>
     <w:rPr>
       <w:vertAlign w:val="superscript"/>
     </w:rPr>
   </w:style>
-  <w:style w:styleId="Hyperlink" w:type="character">
+  <w:style w:type="character" w:styleId="Hyperlink">
     <w:name w:val="Hyperlink"/>
-    <w:basedOn w:val="BodyTextChar"/>
-    <w:rPr>
-      <w:color w:themeColor="accent1" w:val="4F81BD"/>
-    </w:rPr>
-  </w:style>
-  <w:style w:styleId="TOCHeading" w:type="paragraph">
+    <w:basedOn w:val="CaptionChar"/>
+    <w:rPr>
+      <w:color w:val="156082" w:themeColor="accent1"/>
+    </w:rPr>
+  </w:style>
+  <w:style w:type="paragraph" w:styleId="TOCHeading">
     <w:name w:val="TOC Heading"/>
     <w:basedOn w:val="Heading1"/>
     <w:next w:val="BodyText"/>
@@ -2221,246 +2153,305 @@
       <w:spacing w:before="240" w:line="259" w:lineRule="auto"/>
       <w:outlineLvl w:val="9"/>
     </w:pPr>
-    <w:rPr>
-      <w:rFonts w:asciiTheme="majorHAnsi" w:cstheme="majorBidi" w:eastAsiaTheme="majorEastAsia" w:hAnsiTheme="majorHAnsi"/>
-      <w:b w:val="0"/>
-      <w:bCs w:val="0"/>
-      <w:color w:themeColor="accent1" w:themeShade="BF" w:val="365F91"/>
-    </w:rPr>
   </w:style>
   <w:style w:type="paragraph" w:customStyle="1" w:styleId="SourceCode">
     <w:name w:val="Source Code"/>
     <w:basedOn w:val="Normal"/>
     <w:link w:val="VerbatimChar"/>
     <w:pPr>
-      <w:wordWrap w:val="off"/>
+      <w:wordWrap w:val="0"/>
     </w:pPr>
   </w:style>
   <w:style w:type="character" w:customStyle="1" w:styleId="KeywordTok">
     <w:name w:val="KeywordTok"/>
     <w:basedOn w:val="VerbatimChar"/>
     <w:rPr>
+      <w:rFonts w:ascii="Consolas" w:hAnsi="Consolas"/>
       <w:b/>
       <w:color w:val="007020"/>
+      <w:sz w:val="22"/>
     </w:rPr>
   </w:style>
   <w:style w:type="character" w:customStyle="1" w:styleId="DataTypeTok">
     <w:name w:val="DataTypeTok"/>
     <w:basedOn w:val="VerbatimChar"/>
     <w:rPr>
+      <w:rFonts w:ascii="Consolas" w:hAnsi="Consolas"/>
       <w:color w:val="902000"/>
+      <w:sz w:val="22"/>
     </w:rPr>
   </w:style>
   <w:style w:type="character" w:customStyle="1" w:styleId="DecValTok">
     <w:name w:val="DecValTok"/>
     <w:basedOn w:val="VerbatimChar"/>
     <w:rPr>
-      <w:color w:val="40a070"/>
+      <w:rFonts w:ascii="Consolas" w:hAnsi="Consolas"/>
+      <w:color w:val="40A070"/>
+      <w:sz w:val="22"/>
     </w:rPr>
   </w:style>
   <w:style w:type="character" w:customStyle="1" w:styleId="BaseNTok">
     <w:name w:val="BaseNTok"/>
     <w:basedOn w:val="VerbatimChar"/>
     <w:rPr>
-      <w:color w:val="40a070"/>
+      <w:rFonts w:ascii="Consolas" w:hAnsi="Consolas"/>
+      <w:color w:val="40A070"/>
+      <w:sz w:val="22"/>
     </w:rPr>
   </w:style>
   <w:style w:type="character" w:customStyle="1" w:styleId="FloatTok">
     <w:name w:val="FloatTok"/>
     <w:basedOn w:val="VerbatimChar"/>
     <w:rPr>
-      <w:color w:val="40a070"/>
+      <w:rFonts w:ascii="Consolas" w:hAnsi="Consolas"/>
+      <w:color w:val="40A070"/>
+      <w:sz w:val="22"/>
     </w:rPr>
   </w:style>
   <w:style w:type="character" w:customStyle="1" w:styleId="ConstantTok">
     <w:name w:val="ConstantTok"/>
     <w:basedOn w:val="VerbatimChar"/>
     <w:rPr>
+      <w:rFonts w:ascii="Consolas" w:hAnsi="Consolas"/>
       <w:color w:val="880000"/>
+      <w:sz w:val="22"/>
     </w:rPr>
   </w:style>
   <w:style w:type="character" w:customStyle="1" w:styleId="CharTok">
     <w:name w:val="CharTok"/>
     <w:basedOn w:val="VerbatimChar"/>
     <w:rPr>
-      <w:color w:val="4070a0"/>
+      <w:rFonts w:ascii="Consolas" w:hAnsi="Consolas"/>
+      <w:color w:val="4070A0"/>
+      <w:sz w:val="22"/>
     </w:rPr>
   </w:style>
   <w:style w:type="character" w:customStyle="1" w:styleId="SpecialCharTok">
     <w:name w:val="SpecialCharTok"/>
     <w:basedOn w:val="VerbatimChar"/>
     <w:rPr>
-      <w:color w:val="4070a0"/>
+      <w:rFonts w:ascii="Consolas" w:hAnsi="Consolas"/>
+      <w:color w:val="4070A0"/>
+      <w:sz w:val="22"/>
     </w:rPr>
   </w:style>
   <w:style w:type="character" w:customStyle="1" w:styleId="StringTok">
     <w:name w:val="StringTok"/>
     <w:basedOn w:val="VerbatimChar"/>
     <w:rPr>
-      <w:color w:val="4070a0"/>
+      <w:rFonts w:ascii="Consolas" w:hAnsi="Consolas"/>
+      <w:color w:val="4070A0"/>
+      <w:sz w:val="22"/>
     </w:rPr>
   </w:style>
   <w:style w:type="character" w:customStyle="1" w:styleId="VerbatimStringTok">
     <w:name w:val="VerbatimStringTok"/>
     <w:basedOn w:val="VerbatimChar"/>
     <w:rPr>
-      <w:color w:val="4070a0"/>
+      <w:rFonts w:ascii="Consolas" w:hAnsi="Consolas"/>
+      <w:color w:val="4070A0"/>
+      <w:sz w:val="22"/>
     </w:rPr>
   </w:style>
   <w:style w:type="character" w:customStyle="1" w:styleId="SpecialStringTok">
     <w:name w:val="SpecialStringTok"/>
     <w:basedOn w:val="VerbatimChar"/>
     <w:rPr>
-      <w:color w:val="bb6688"/>
+      <w:rFonts w:ascii="Consolas" w:hAnsi="Consolas"/>
+      <w:color w:val="BB6688"/>
+      <w:sz w:val="22"/>
     </w:rPr>
   </w:style>
   <w:style w:type="character" w:customStyle="1" w:styleId="ImportTok">
     <w:name w:val="ImportTok"/>
     <w:basedOn w:val="VerbatimChar"/>
     <w:rPr>
+      <w:rFonts w:ascii="Consolas" w:hAnsi="Consolas"/>
       <w:b/>
       <w:color w:val="008000"/>
+      <w:sz w:val="22"/>
     </w:rPr>
   </w:style>
   <w:style w:type="character" w:customStyle="1" w:styleId="CommentTok">
     <w:name w:val="CommentTok"/>
     <w:basedOn w:val="VerbatimChar"/>
     <w:rPr>
+      <w:rFonts w:ascii="Consolas" w:hAnsi="Consolas"/>
       <w:i/>
-      <w:color w:val="60a0b0"/>
+      <w:color w:val="60A0B0"/>
+      <w:sz w:val="22"/>
     </w:rPr>
   </w:style>
   <w:style w:type="character" w:customStyle="1" w:styleId="DocumentationTok">
     <w:name w:val="DocumentationTok"/>
     <w:basedOn w:val="VerbatimChar"/>
     <w:rPr>
+      <w:rFonts w:ascii="Consolas" w:hAnsi="Consolas"/>
       <w:i/>
-      <w:color w:val="ba2121"/>
+      <w:color w:val="BA2121"/>
+      <w:sz w:val="22"/>
     </w:rPr>
   </w:style>
   <w:style w:type="character" w:customStyle="1" w:styleId="AnnotationTok">
     <w:name w:val="AnnotationTok"/>
     <w:basedOn w:val="VerbatimChar"/>
     <w:rPr>
+      <w:rFonts w:ascii="Consolas" w:hAnsi="Consolas"/>
       <w:b/>
       <w:i/>
-      <w:color w:val="60a0b0"/>
+      <w:color w:val="60A0B0"/>
+      <w:sz w:val="22"/>
     </w:rPr>
   </w:style>
   <w:style w:type="character" w:customStyle="1" w:styleId="CommentVarTok">
     <w:name w:val="CommentVarTok"/>
     <w:basedOn w:val="VerbatimChar"/>
     <w:rPr>
+      <w:rFonts w:ascii="Consolas" w:hAnsi="Consolas"/>
       <w:b/>
       <w:i/>
-      <w:color w:val="60a0b0"/>
+      <w:color w:val="60A0B0"/>
+      <w:sz w:val="22"/>
     </w:rPr>
   </w:style>
   <w:style w:type="character" w:customStyle="1" w:styleId="OtherTok">
     <w:name w:val="OtherTok"/>
     <w:basedOn w:val="VerbatimChar"/>
     <w:rPr>
+      <w:rFonts w:ascii="Consolas" w:hAnsi="Consolas"/>
       <w:color w:val="007020"/>
+      <w:sz w:val="22"/>
     </w:rPr>
   </w:style>
   <w:style w:type="character" w:customStyle="1" w:styleId="FunctionTok">
     <w:name w:val="FunctionTok"/>
     <w:basedOn w:val="VerbatimChar"/>
     <w:rPr>
-      <w:color w:val="06287e"/>
+      <w:rFonts w:ascii="Consolas" w:hAnsi="Consolas"/>
+      <w:color w:val="06287E"/>
+      <w:sz w:val="22"/>
     </w:rPr>
   </w:style>
   <w:style w:type="character" w:customStyle="1" w:styleId="VariableTok">
     <w:name w:val="VariableTok"/>
     <w:basedOn w:val="VerbatimChar"/>
     <w:rPr>
-      <w:color w:val="19177c"/>
+      <w:rFonts w:ascii="Consolas" w:hAnsi="Consolas"/>
+      <w:color w:val="19177C"/>
+      <w:sz w:val="22"/>
     </w:rPr>
   </w:style>
   <w:style w:type="character" w:customStyle="1" w:styleId="ControlFlowTok">
     <w:name w:val="ControlFlowTok"/>
     <w:basedOn w:val="VerbatimChar"/>
     <w:rPr>
+      <w:rFonts w:ascii="Consolas" w:hAnsi="Consolas"/>
       <w:b/>
       <w:color w:val="007020"/>
+      <w:sz w:val="22"/>
     </w:rPr>
   </w:style>
   <w:style w:type="character" w:customStyle="1" w:styleId="OperatorTok">
     <w:name w:val="OperatorTok"/>
     <w:basedOn w:val="VerbatimChar"/>
     <w:rPr>
+      <w:rFonts w:ascii="Consolas" w:hAnsi="Consolas"/>
       <w:color w:val="666666"/>
+      <w:sz w:val="22"/>
     </w:rPr>
   </w:style>
   <w:style w:type="character" w:customStyle="1" w:styleId="BuiltInTok">
     <w:name w:val="BuiltInTok"/>
     <w:basedOn w:val="VerbatimChar"/>
     <w:rPr>
+      <w:rFonts w:ascii="Consolas" w:hAnsi="Consolas"/>
       <w:color w:val="008000"/>
+      <w:sz w:val="22"/>
     </w:rPr>
   </w:style>
   <w:style w:type="character" w:customStyle="1" w:styleId="ExtensionTok">
     <w:name w:val="ExtensionTok"/>
     <w:basedOn w:val="VerbatimChar"/>
-    <w:rPr/>
+    <w:rPr>
+      <w:rFonts w:ascii="Consolas" w:hAnsi="Consolas"/>
+      <w:sz w:val="22"/>
+    </w:rPr>
   </w:style>
   <w:style w:type="character" w:customStyle="1" w:styleId="PreprocessorTok">
     <w:name w:val="PreprocessorTok"/>
     <w:basedOn w:val="VerbatimChar"/>
     <w:rPr>
-      <w:color w:val="bc7a00"/>
+      <w:rFonts w:ascii="Consolas" w:hAnsi="Consolas"/>
+      <w:color w:val="BC7A00"/>
+      <w:sz w:val="22"/>
     </w:rPr>
   </w:style>
   <w:style w:type="character" w:customStyle="1" w:styleId="AttributeTok">
     <w:name w:val="AttributeTok"/>
     <w:basedOn w:val="VerbatimChar"/>
     <w:rPr>
-      <w:color w:val="7d9029"/>
+      <w:rFonts w:ascii="Consolas" w:hAnsi="Consolas"/>
+      <w:color w:val="7D9029"/>
+      <w:sz w:val="22"/>
     </w:rPr>
   </w:style>
   <w:style w:type="character" w:customStyle="1" w:styleId="RegionMarkerTok">
     <w:name w:val="RegionMarkerTok"/>
     <w:basedOn w:val="VerbatimChar"/>
-    <w:rPr/>
+    <w:rPr>
+      <w:rFonts w:ascii="Consolas" w:hAnsi="Consolas"/>
+      <w:sz w:val="22"/>
+    </w:rPr>
   </w:style>
   <w:style w:type="character" w:customStyle="1" w:styleId="InformationTok">
     <w:name w:val="InformationTok"/>
     <w:basedOn w:val="VerbatimChar"/>
     <w:rPr>
+      <w:rFonts w:ascii="Consolas" w:hAnsi="Consolas"/>
       <w:b/>
       <w:i/>
-      <w:color w:val="60a0b0"/>
+      <w:color w:val="60A0B0"/>
+      <w:sz w:val="22"/>
     </w:rPr>
   </w:style>
   <w:style w:type="character" w:customStyle="1" w:styleId="WarningTok">
     <w:name w:val="WarningTok"/>
     <w:basedOn w:val="VerbatimChar"/>
     <w:rPr>
+      <w:rFonts w:ascii="Consolas" w:hAnsi="Consolas"/>
       <w:b/>
       <w:i/>
-      <w:color w:val="60a0b0"/>
+      <w:color w:val="60A0B0"/>
+      <w:sz w:val="22"/>
     </w:rPr>
   </w:style>
   <w:style w:type="character" w:customStyle="1" w:styleId="AlertTok">
     <w:name w:val="AlertTok"/>
     <w:basedOn w:val="VerbatimChar"/>
     <w:rPr>
+      <w:rFonts w:ascii="Consolas" w:hAnsi="Consolas"/>
       <w:b/>
-      <w:color w:val="ff0000"/>
+      <w:color w:val="FF0000"/>
+      <w:sz w:val="22"/>
     </w:rPr>
   </w:style>
   <w:style w:type="character" w:customStyle="1" w:styleId="ErrorTok">
     <w:name w:val="ErrorTok"/>
     <w:basedOn w:val="VerbatimChar"/>
     <w:rPr>
+      <w:rFonts w:ascii="Consolas" w:hAnsi="Consolas"/>
       <w:b/>
-      <w:color w:val="ff0000"/>
+      <w:color w:val="FF0000"/>
+      <w:sz w:val="22"/>
     </w:rPr>
   </w:style>
   <w:style w:type="character" w:customStyle="1" w:styleId="NormalTok">
     <w:name w:val="NormalTok"/>
     <w:basedOn w:val="VerbatimChar"/>
-    <w:rPr/>
+    <w:rPr>
+      <w:rFonts w:ascii="Consolas" w:hAnsi="Consolas"/>
+      <w:sz w:val="22"/>
+    </w:rPr>
   </w:style>
 </w:styles>
 </file>

</xml_diff>